<commit_message>
feat(reference): regions, fulfilment centres, crops/varieties, unions as data
Brief 2A-2C: all 16 regions and centres, four demo crops with varieties,
farmer unions and farmer crops, plus profile columns on users (region,
union, buyer type, MoFA flag, vendor ownership). Pilot = Greater Accra/Tema
+ Maize active, others switchable from Super Admin endpoints (audited).
Adds public /api/public/stats|crops|regions, GET /auth/me, migration 0002,
a generated schema doc + ERD, API docs section 20 and SDD section 34.

Co-Authored-By: Claude Opus 5.5 <noreply@anthropic.com>
</commit_message>
<xml_diff>
--- a/Farm_Master_API_Documentation_Stage6.docx
+++ b/Farm_Master_API_Documentation_Stage6.docx
@@ -6031,6 +6031,811 @@
             <w:r/>
             <w:r>
               <w:t>404 unless the listing is active.</w:t>
+            </w:r>
+          </w:p>
+        </w:tc>
+      </w:tr>
+    </w:tbl>
+    <w:p>
+      <w:pPr>
+        <w:pStyle w:val="Heading1"/>
+      </w:pPr>
+      <w:r>
+        <w:t>20. Public, Profile and Reference-Data Endpoints (added 11 October 2026)</w:t>
+      </w:r>
+    </w:p>
+    <w:p>
+      <w:r>
+        <w:t>Added for the CEO platform demo alignment (docs/ceo-demo-gap-report.md). The /api/public routes need no authentication and only ever return aggregate or reference data.</w:t>
+      </w:r>
+    </w:p>
+    <w:tbl>
+      <w:tblPr>
+        <w:tblStyle w:val="TableGrid"/>
+        <w:tblW w:type="auto" w:w="0"/>
+        <w:tblLook w:firstColumn="1" w:firstRow="1" w:lastColumn="0" w:lastRow="0" w:noHBand="0" w:noVBand="1" w:val="04A0"/>
+      </w:tblPr>
+      <w:tblGrid>
+        <w:gridCol w:w="2160"/>
+        <w:gridCol w:w="2160"/>
+        <w:gridCol w:w="2160"/>
+        <w:gridCol w:w="2160"/>
+      </w:tblGrid>
+      <w:tr>
+        <w:tc>
+          <w:tcPr>
+            <w:tcW w:type="dxa" w:w="2160"/>
+          </w:tcPr>
+          <w:p>
+            <w:r/>
+            <w:r>
+              <w:rPr>
+                <w:b/>
+                <w:sz w:val="18"/>
+              </w:rPr>
+              <w:t>Method &amp; path</w:t>
+            </w:r>
+          </w:p>
+        </w:tc>
+        <w:tc>
+          <w:tcPr>
+            <w:tcW w:type="dxa" w:w="2160"/>
+          </w:tcPr>
+          <w:p>
+            <w:r/>
+            <w:r>
+              <w:rPr>
+                <w:b/>
+                <w:sz w:val="18"/>
+              </w:rPr>
+              <w:t>Request body</w:t>
+            </w:r>
+          </w:p>
+        </w:tc>
+        <w:tc>
+          <w:tcPr>
+            <w:tcW w:type="dxa" w:w="2160"/>
+          </w:tcPr>
+          <w:p>
+            <w:r/>
+            <w:r>
+              <w:rPr>
+                <w:b/>
+                <w:sz w:val="18"/>
+              </w:rPr>
+              <w:t>Response</w:t>
+            </w:r>
+          </w:p>
+        </w:tc>
+        <w:tc>
+          <w:tcPr>
+            <w:tcW w:type="dxa" w:w="2160"/>
+          </w:tcPr>
+          <w:p>
+            <w:r/>
+            <w:r>
+              <w:rPr>
+                <w:b/>
+                <w:sz w:val="18"/>
+              </w:rPr>
+              <w:t>Notes</w:t>
+            </w:r>
+          </w:p>
+        </w:tc>
+      </w:tr>
+      <w:tr>
+        <w:tc>
+          <w:tcPr>
+            <w:tcW w:type="dxa" w:w="2160"/>
+          </w:tcPr>
+          <w:p>
+            <w:r/>
+            <w:r>
+              <w:rPr>
+                <w:sz w:val="18"/>
+              </w:rPr>
+              <w:t>GET /api/public/stats</w:t>
+            </w:r>
+          </w:p>
+        </w:tc>
+        <w:tc>
+          <w:tcPr>
+            <w:tcW w:type="dxa" w:w="2160"/>
+          </w:tcPr>
+          <w:p>
+            <w:r/>
+            <w:r>
+              <w:rPr>
+                <w:sz w:val="18"/>
+              </w:rPr>
+              <w:t>-</w:t>
+            </w:r>
+          </w:p>
+        </w:tc>
+        <w:tc>
+          <w:tcPr>
+            <w:tcW w:type="dxa" w:w="2160"/>
+          </w:tcPr>
+          <w:p>
+            <w:r/>
+            <w:r>
+              <w:rPr>
+                <w:sz w:val="18"/>
+              </w:rPr>
+              <w:t>PublicStatsResponse</w:t>
+            </w:r>
+          </w:p>
+        </w:tc>
+        <w:tc>
+          <w:tcPr>
+            <w:tcW w:type="dxa" w:w="2160"/>
+          </w:tcPr>
+          <w:p>
+            <w:r/>
+            <w:r>
+              <w:rPr>
+                <w:sz w:val="18"/>
+              </w:rPr>
+              <w:t>Landing-page ledger: coordinated_portals (count of self-registering portal roles), fulfilment_centres (all configured), active_fulfilment_centres, revenue_streams (rate_config revenue_streams_count), head_office (HQ centre town). Public.</w:t>
+            </w:r>
+          </w:p>
+        </w:tc>
+      </w:tr>
+      <w:tr>
+        <w:tc>
+          <w:tcPr>
+            <w:tcW w:type="dxa" w:w="2160"/>
+          </w:tcPr>
+          <w:p>
+            <w:r/>
+            <w:r>
+              <w:rPr>
+                <w:sz w:val="18"/>
+              </w:rPr>
+              <w:t>GET /api/public/crops</w:t>
+            </w:r>
+          </w:p>
+        </w:tc>
+        <w:tc>
+          <w:tcPr>
+            <w:tcW w:type="dxa" w:w="2160"/>
+          </w:tcPr>
+          <w:p>
+            <w:r/>
+            <w:r>
+              <w:rPr>
+                <w:sz w:val="18"/>
+              </w:rPr>
+              <w:t>-</w:t>
+            </w:r>
+          </w:p>
+        </w:tc>
+        <w:tc>
+          <w:tcPr>
+            <w:tcW w:type="dxa" w:w="2160"/>
+          </w:tcPr>
+          <w:p>
+            <w:r/>
+            <w:r>
+              <w:rPr>
+                <w:sz w:val="18"/>
+              </w:rPr>
+              <w:t>List[CropResponse]</w:t>
+            </w:r>
+          </w:p>
+        </w:tc>
+        <w:tc>
+          <w:tcPr>
+            <w:tcW w:type="dxa" w:w="2160"/>
+          </w:tcPr>
+          <w:p>
+            <w:r/>
+            <w:r>
+              <w:rPr>
+                <w:sz w:val="18"/>
+              </w:rPr>
+              <w:t>Crops with is_active_for_ordering = true, active varieties only. Public. Pilot returns Maize (Obatanpa) only.</w:t>
+            </w:r>
+          </w:p>
+        </w:tc>
+      </w:tr>
+      <w:tr>
+        <w:tc>
+          <w:tcPr>
+            <w:tcW w:type="dxa" w:w="2160"/>
+          </w:tcPr>
+          <w:p>
+            <w:r/>
+            <w:r>
+              <w:rPr>
+                <w:sz w:val="18"/>
+              </w:rPr>
+              <w:t>GET /api/public/regions</w:t>
+            </w:r>
+          </w:p>
+        </w:tc>
+        <w:tc>
+          <w:tcPr>
+            <w:tcW w:type="dxa" w:w="2160"/>
+          </w:tcPr>
+          <w:p>
+            <w:r/>
+            <w:r>
+              <w:rPr>
+                <w:sz w:val="18"/>
+              </w:rPr>
+              <w:t>-</w:t>
+            </w:r>
+          </w:p>
+        </w:tc>
+        <w:tc>
+          <w:tcPr>
+            <w:tcW w:type="dxa" w:w="2160"/>
+          </w:tcPr>
+          <w:p>
+            <w:r/>
+            <w:r>
+              <w:rPr>
+                <w:sz w:val="18"/>
+              </w:rPr>
+              <w:t>List[RegionResponse]</w:t>
+            </w:r>
+          </w:p>
+        </w:tc>
+        <w:tc>
+          <w:tcPr>
+            <w:tcW w:type="dxa" w:w="2160"/>
+          </w:tcPr>
+          <w:p>
+            <w:r/>
+            <w:r>
+              <w:rPr>
+                <w:sz w:val="18"/>
+              </w:rPr>
+              <w:t>Active regions only. Public.</w:t>
+            </w:r>
+          </w:p>
+        </w:tc>
+      </w:tr>
+      <w:tr>
+        <w:tc>
+          <w:tcPr>
+            <w:tcW w:type="dxa" w:w="2160"/>
+          </w:tcPr>
+          <w:p>
+            <w:r/>
+            <w:r>
+              <w:rPr>
+                <w:sz w:val="18"/>
+              </w:rPr>
+              <w:t>GET /auth/me</w:t>
+            </w:r>
+          </w:p>
+        </w:tc>
+        <w:tc>
+          <w:tcPr>
+            <w:tcW w:type="dxa" w:w="2160"/>
+          </w:tcPr>
+          <w:p>
+            <w:r/>
+            <w:r>
+              <w:rPr>
+                <w:sz w:val="18"/>
+              </w:rPr>
+              <w:t>-</w:t>
+            </w:r>
+          </w:p>
+        </w:tc>
+        <w:tc>
+          <w:tcPr>
+            <w:tcW w:type="dxa" w:w="2160"/>
+          </w:tcPr>
+          <w:p>
+            <w:r/>
+            <w:r>
+              <w:rPr>
+                <w:sz w:val="18"/>
+              </w:rPr>
+              <w:t>MeResponse</w:t>
+            </w:r>
+          </w:p>
+        </w:tc>
+        <w:tc>
+          <w:tcPr>
+            <w:tcW w:type="dxa" w:w="2160"/>
+          </w:tcPr>
+          <w:p>
+            <w:r/>
+            <w:r>
+              <w:rPr>
+                <w:sz w:val="18"/>
+              </w:rPr>
+              <w:t>Any authenticated role. Returns profile_line, the portal header text: Farmer '{name} · {union} · {region} Region', Buyer '{org} · Institutional|Private buyer', Vendor '{org} · Farm Master-owned|Third-party vendor'. Also region, farmer_union, buyer_type, mofa_verified, vendor_ownership and crops (farmer's registered crops).</w:t>
+            </w:r>
+          </w:p>
+        </w:tc>
+      </w:tr>
+    </w:tbl>
+    <w:p>
+      <w:r>
+        <w:t>Super Admin only (same segregation-of-duties rule as the rest of /admin). Every change writes an audit-log entry (crop_updated, crop_variety_added, region_toggled, fulfilment_centre_toggled).</w:t>
+      </w:r>
+    </w:p>
+    <w:tbl>
+      <w:tblPr>
+        <w:tblStyle w:val="TableGrid"/>
+        <w:tblW w:type="auto" w:w="0"/>
+        <w:tblLook w:firstColumn="1" w:firstRow="1" w:lastColumn="0" w:lastRow="0" w:noHBand="0" w:noVBand="1" w:val="04A0"/>
+      </w:tblPr>
+      <w:tblGrid>
+        <w:gridCol w:w="2160"/>
+        <w:gridCol w:w="2160"/>
+        <w:gridCol w:w="2160"/>
+        <w:gridCol w:w="2160"/>
+      </w:tblGrid>
+      <w:tr>
+        <w:tc>
+          <w:tcPr>
+            <w:tcW w:type="dxa" w:w="2160"/>
+          </w:tcPr>
+          <w:p>
+            <w:r/>
+            <w:r>
+              <w:rPr>
+                <w:b/>
+                <w:sz w:val="18"/>
+              </w:rPr>
+              <w:t>Method &amp; path</w:t>
+            </w:r>
+          </w:p>
+        </w:tc>
+        <w:tc>
+          <w:tcPr>
+            <w:tcW w:type="dxa" w:w="2160"/>
+          </w:tcPr>
+          <w:p>
+            <w:r/>
+            <w:r>
+              <w:rPr>
+                <w:b/>
+                <w:sz w:val="18"/>
+              </w:rPr>
+              <w:t>Request body</w:t>
+            </w:r>
+          </w:p>
+        </w:tc>
+        <w:tc>
+          <w:tcPr>
+            <w:tcW w:type="dxa" w:w="2160"/>
+          </w:tcPr>
+          <w:p>
+            <w:r/>
+            <w:r>
+              <w:rPr>
+                <w:b/>
+                <w:sz w:val="18"/>
+              </w:rPr>
+              <w:t>Response</w:t>
+            </w:r>
+          </w:p>
+        </w:tc>
+        <w:tc>
+          <w:tcPr>
+            <w:tcW w:type="dxa" w:w="2160"/>
+          </w:tcPr>
+          <w:p>
+            <w:r/>
+            <w:r>
+              <w:rPr>
+                <w:b/>
+                <w:sz w:val="18"/>
+              </w:rPr>
+              <w:t>Notes</w:t>
+            </w:r>
+          </w:p>
+        </w:tc>
+      </w:tr>
+      <w:tr>
+        <w:tc>
+          <w:tcPr>
+            <w:tcW w:type="dxa" w:w="2160"/>
+          </w:tcPr>
+          <w:p>
+            <w:r/>
+            <w:r>
+              <w:rPr>
+                <w:sz w:val="18"/>
+              </w:rPr>
+              <w:t>GET /admin/crops</w:t>
+            </w:r>
+          </w:p>
+        </w:tc>
+        <w:tc>
+          <w:tcPr>
+            <w:tcW w:type="dxa" w:w="2160"/>
+          </w:tcPr>
+          <w:p>
+            <w:r/>
+            <w:r>
+              <w:rPr>
+                <w:sz w:val="18"/>
+              </w:rPr>
+              <w:t>-</w:t>
+            </w:r>
+          </w:p>
+        </w:tc>
+        <w:tc>
+          <w:tcPr>
+            <w:tcW w:type="dxa" w:w="2160"/>
+          </w:tcPr>
+          <w:p>
+            <w:r/>
+            <w:r>
+              <w:rPr>
+                <w:sz w:val="18"/>
+              </w:rPr>
+              <w:t>List[CropResponse]</w:t>
+            </w:r>
+          </w:p>
+        </w:tc>
+        <w:tc>
+          <w:tcPr>
+            <w:tcW w:type="dxa" w:w="2160"/>
+          </w:tcPr>
+          <w:p>
+            <w:r/>
+            <w:r>
+              <w:rPr>
+                <w:sz w:val="18"/>
+              </w:rPr>
+              <w:t>All crops, active or not, with every variety.</w:t>
+            </w:r>
+          </w:p>
+        </w:tc>
+      </w:tr>
+      <w:tr>
+        <w:tc>
+          <w:tcPr>
+            <w:tcW w:type="dxa" w:w="2160"/>
+          </w:tcPr>
+          <w:p>
+            <w:r/>
+            <w:r>
+              <w:rPr>
+                <w:sz w:val="18"/>
+              </w:rPr>
+              <w:t>PUT /admin/crops/{id}</w:t>
+            </w:r>
+          </w:p>
+        </w:tc>
+        <w:tc>
+          <w:tcPr>
+            <w:tcW w:type="dxa" w:w="2160"/>
+          </w:tcPr>
+          <w:p>
+            <w:r/>
+            <w:r>
+              <w:rPr>
+                <w:sz w:val="18"/>
+              </w:rPr>
+              <w:t>CropUpdate {is_active_for_ordering?, reference_price_per_tonne?}</w:t>
+            </w:r>
+          </w:p>
+        </w:tc>
+        <w:tc>
+          <w:tcPr>
+            <w:tcW w:type="dxa" w:w="2160"/>
+          </w:tcPr>
+          <w:p>
+            <w:r/>
+            <w:r>
+              <w:rPr>
+                <w:sz w:val="18"/>
+              </w:rPr>
+              <w:t>CropResponse</w:t>
+            </w:r>
+          </w:p>
+        </w:tc>
+        <w:tc>
+          <w:tcPr>
+            <w:tcW w:type="dxa" w:w="2160"/>
+          </w:tcPr>
+          <w:p>
+            <w:r/>
+            <w:r>
+              <w:rPr>
+                <w:sz w:val="18"/>
+              </w:rPr>
+              <w:t>Activating a crop opens it to buyers and farmer matching with no code change. Price must be &gt; 0 (422).</w:t>
+            </w:r>
+          </w:p>
+        </w:tc>
+      </w:tr>
+      <w:tr>
+        <w:tc>
+          <w:tcPr>
+            <w:tcW w:type="dxa" w:w="2160"/>
+          </w:tcPr>
+          <w:p>
+            <w:r/>
+            <w:r>
+              <w:rPr>
+                <w:sz w:val="18"/>
+              </w:rPr>
+              <w:t>POST /admin/crops/{id}/varieties</w:t>
+            </w:r>
+          </w:p>
+        </w:tc>
+        <w:tc>
+          <w:tcPr>
+            <w:tcW w:type="dxa" w:w="2160"/>
+          </w:tcPr>
+          <w:p>
+            <w:r/>
+            <w:r>
+              <w:rPr>
+                <w:sz w:val="18"/>
+              </w:rPr>
+              <w:t>CropVarietyCreate {name, description?}</w:t>
+            </w:r>
+          </w:p>
+        </w:tc>
+        <w:tc>
+          <w:tcPr>
+            <w:tcW w:type="dxa" w:w="2160"/>
+          </w:tcPr>
+          <w:p>
+            <w:r/>
+            <w:r>
+              <w:rPr>
+                <w:sz w:val="18"/>
+              </w:rPr>
+              <w:t>CropResponse</w:t>
+            </w:r>
+          </w:p>
+        </w:tc>
+        <w:tc>
+          <w:tcPr>
+            <w:tcW w:type="dxa" w:w="2160"/>
+          </w:tcPr>
+          <w:p>
+            <w:r/>
+            <w:r>
+              <w:rPr>
+                <w:sz w:val="18"/>
+              </w:rPr>
+              <w:t>409 if the crop already has that variety (case-insensitive).</w:t>
+            </w:r>
+          </w:p>
+        </w:tc>
+      </w:tr>
+      <w:tr>
+        <w:tc>
+          <w:tcPr>
+            <w:tcW w:type="dxa" w:w="2160"/>
+          </w:tcPr>
+          <w:p>
+            <w:r/>
+            <w:r>
+              <w:rPr>
+                <w:sz w:val="18"/>
+              </w:rPr>
+              <w:t>GET /admin/regions</w:t>
+            </w:r>
+          </w:p>
+        </w:tc>
+        <w:tc>
+          <w:tcPr>
+            <w:tcW w:type="dxa" w:w="2160"/>
+          </w:tcPr>
+          <w:p>
+            <w:r/>
+            <w:r>
+              <w:rPr>
+                <w:sz w:val="18"/>
+              </w:rPr>
+              <w:t>-</w:t>
+            </w:r>
+          </w:p>
+        </w:tc>
+        <w:tc>
+          <w:tcPr>
+            <w:tcW w:type="dxa" w:w="2160"/>
+          </w:tcPr>
+          <w:p>
+            <w:r/>
+            <w:r>
+              <w:rPr>
+                <w:sz w:val="18"/>
+              </w:rPr>
+              <w:t>List[RegionResponse]</w:t>
+            </w:r>
+          </w:p>
+        </w:tc>
+        <w:tc>
+          <w:tcPr>
+            <w:tcW w:type="dxa" w:w="2160"/>
+          </w:tcPr>
+          <w:p>
+            <w:r/>
+            <w:r>
+              <w:rPr>
+                <w:sz w:val="18"/>
+              </w:rPr>
+              <w:t>All 16 regions.</w:t>
+            </w:r>
+          </w:p>
+        </w:tc>
+      </w:tr>
+      <w:tr>
+        <w:tc>
+          <w:tcPr>
+            <w:tcW w:type="dxa" w:w="2160"/>
+          </w:tcPr>
+          <w:p>
+            <w:r/>
+            <w:r>
+              <w:rPr>
+                <w:sz w:val="18"/>
+              </w:rPr>
+              <w:t>PUT /admin/regions/{id}</w:t>
+            </w:r>
+          </w:p>
+        </w:tc>
+        <w:tc>
+          <w:tcPr>
+            <w:tcW w:type="dxa" w:w="2160"/>
+          </w:tcPr>
+          <w:p>
+            <w:r/>
+            <w:r>
+              <w:rPr>
+                <w:sz w:val="18"/>
+              </w:rPr>
+              <w:t>ActiveToggle {is_active}</w:t>
+            </w:r>
+          </w:p>
+        </w:tc>
+        <w:tc>
+          <w:tcPr>
+            <w:tcW w:type="dxa" w:w="2160"/>
+          </w:tcPr>
+          <w:p>
+            <w:r/>
+            <w:r>
+              <w:rPr>
+                <w:sz w:val="18"/>
+              </w:rPr>
+              <w:t>RegionResponse</w:t>
+            </w:r>
+          </w:p>
+        </w:tc>
+        <w:tc>
+          <w:tcPr>
+            <w:tcW w:type="dxa" w:w="2160"/>
+          </w:tcPr>
+          <w:p>
+            <w:r/>
+            <w:r>
+              <w:rPr>
+                <w:sz w:val="18"/>
+              </w:rPr>
+            </w:r>
+          </w:p>
+        </w:tc>
+      </w:tr>
+      <w:tr>
+        <w:tc>
+          <w:tcPr>
+            <w:tcW w:type="dxa" w:w="2160"/>
+          </w:tcPr>
+          <w:p>
+            <w:r/>
+            <w:r>
+              <w:rPr>
+                <w:sz w:val="18"/>
+              </w:rPr>
+              <w:t>GET /admin/fulfilment-centres</w:t>
+            </w:r>
+          </w:p>
+        </w:tc>
+        <w:tc>
+          <w:tcPr>
+            <w:tcW w:type="dxa" w:w="2160"/>
+          </w:tcPr>
+          <w:p>
+            <w:r/>
+            <w:r>
+              <w:rPr>
+                <w:sz w:val="18"/>
+              </w:rPr>
+              <w:t>-</w:t>
+            </w:r>
+          </w:p>
+        </w:tc>
+        <w:tc>
+          <w:tcPr>
+            <w:tcW w:type="dxa" w:w="2160"/>
+          </w:tcPr>
+          <w:p>
+            <w:r/>
+            <w:r>
+              <w:rPr>
+                <w:sz w:val="18"/>
+              </w:rPr>
+              <w:t>List[FulfilmentCentreResponse]</w:t>
+            </w:r>
+          </w:p>
+        </w:tc>
+        <w:tc>
+          <w:tcPr>
+            <w:tcW w:type="dxa" w:w="2160"/>
+          </w:tcPr>
+          <w:p>
+            <w:r/>
+            <w:r>
+              <w:rPr>
+                <w:sz w:val="18"/>
+              </w:rPr>
+              <w:t>HQ first.</w:t>
+            </w:r>
+          </w:p>
+        </w:tc>
+      </w:tr>
+      <w:tr>
+        <w:tc>
+          <w:tcPr>
+            <w:tcW w:type="dxa" w:w="2160"/>
+          </w:tcPr>
+          <w:p>
+            <w:r/>
+            <w:r>
+              <w:rPr>
+                <w:sz w:val="18"/>
+              </w:rPr>
+              <w:t>PUT /admin/fulfilment-centres/{id}</w:t>
+            </w:r>
+          </w:p>
+        </w:tc>
+        <w:tc>
+          <w:tcPr>
+            <w:tcW w:type="dxa" w:w="2160"/>
+          </w:tcPr>
+          <w:p>
+            <w:r/>
+            <w:r>
+              <w:rPr>
+                <w:sz w:val="18"/>
+              </w:rPr>
+              <w:t>ActiveToggle {is_active}</w:t>
+            </w:r>
+          </w:p>
+        </w:tc>
+        <w:tc>
+          <w:tcPr>
+            <w:tcW w:type="dxa" w:w="2160"/>
+          </w:tcPr>
+          <w:p>
+            <w:r/>
+            <w:r>
+              <w:rPr>
+                <w:sz w:val="18"/>
+              </w:rPr>
+              <w:t>FulfilmentCentreResponse</w:t>
+            </w:r>
+          </w:p>
+        </w:tc>
+        <w:tc>
+          <w:tcPr>
+            <w:tcW w:type="dxa" w:w="2160"/>
+          </w:tcPr>
+          <w:p>
+            <w:r/>
+            <w:r>
+              <w:rPr>
+                <w:sz w:val="18"/>
+              </w:rPr>
+              <w:t>409 when deactivating the head-office centre.</w:t>
             </w:r>
           </w:p>
         </w:tc>

</xml_diff>

<commit_message>
feat(payments): provider interface, webhook-only settlement, fee rules, FM-#### orders
Brief 2D/5.1: PaymentProvider interface with a sandbox driver (default)
plus Paystack and Hubtel drivers (mock-tested only, not yet run live).
Payments stay PENDING until a verified webhook settles them (signature /
status-API checks, idempotent, amount-checked); the client never marks an
order paid. Networks labelled MTN MoMo / Telecel Cash / AT Money / Card.

Commitment fee becomes a configurable rule (per tonne or % of value, with
a minimum), seeded with PRD 10's GHS 90/t so no figure changes. Orders get
FM-#### references from a Postgres sequence, crop variety, a validated
delivery-by date, spec notes, a DELIVERED status and a derived stepper.
Migration 0003; API docs 21, SDD 35, schema doc, README env vars.

Co-Authored-By: Claude Opus 5.5 <noreply@anthropic.com>
</commit_message>
<xml_diff>
--- a/Farm_Master_API_Documentation_Stage6.docx
+++ b/Farm_Master_API_Documentation_Stage6.docx
@@ -6836,6 +6836,732 @@
                 <w:sz w:val="18"/>
               </w:rPr>
               <w:t>409 when deactivating the head-office centre.</w:t>
+            </w:r>
+          </w:p>
+        </w:tc>
+      </w:tr>
+    </w:tbl>
+    <w:p>
+      <w:pPr>
+        <w:pStyle w:val="Heading1"/>
+      </w:pPr>
+      <w:r>
+        <w:t>21. Buyer Orders, Commitment-Fee Payments and Webhooks (revised 11 October 2026)</w:t>
+      </w:r>
+    </w:p>
+    <w:p>
+      <w:r>
+        <w:t>Supersedes the POST /buyer/requirements and POST /buyer/requirements/{id}/pay rows in Section 2. Payments now go through a PaymentProvider driver (sandbox by default). A payment is returned PENDING and is only marked SUCCESS by a verified provider webhook, never by the client. Requirement responses now also carry reference (FM-####), variety, delivery_by, spec_notes, and the derived status_label / stage_index / progress_pct / badge / steps used by the order stepper.</w:t>
+      </w:r>
+    </w:p>
+    <w:tbl>
+      <w:tblPr>
+        <w:tblStyle w:val="TableGrid"/>
+        <w:tblW w:type="auto" w:w="0"/>
+        <w:tblLook w:firstColumn="1" w:firstRow="1" w:lastColumn="0" w:lastRow="0" w:noHBand="0" w:noVBand="1" w:val="04A0"/>
+      </w:tblPr>
+      <w:tblGrid>
+        <w:gridCol w:w="2160"/>
+        <w:gridCol w:w="2160"/>
+        <w:gridCol w:w="2160"/>
+        <w:gridCol w:w="2160"/>
+      </w:tblGrid>
+      <w:tr>
+        <w:tc>
+          <w:tcPr>
+            <w:tcW w:type="dxa" w:w="2160"/>
+          </w:tcPr>
+          <w:p>
+            <w:r/>
+            <w:r>
+              <w:rPr>
+                <w:b/>
+                <w:sz w:val="18"/>
+              </w:rPr>
+              <w:t>Method &amp; path</w:t>
+            </w:r>
+          </w:p>
+        </w:tc>
+        <w:tc>
+          <w:tcPr>
+            <w:tcW w:type="dxa" w:w="2160"/>
+          </w:tcPr>
+          <w:p>
+            <w:r/>
+            <w:r>
+              <w:rPr>
+                <w:b/>
+                <w:sz w:val="18"/>
+              </w:rPr>
+              <w:t>Request body</w:t>
+            </w:r>
+          </w:p>
+        </w:tc>
+        <w:tc>
+          <w:tcPr>
+            <w:tcW w:type="dxa" w:w="2160"/>
+          </w:tcPr>
+          <w:p>
+            <w:r/>
+            <w:r>
+              <w:rPr>
+                <w:b/>
+                <w:sz w:val="18"/>
+              </w:rPr>
+              <w:t>Response</w:t>
+            </w:r>
+          </w:p>
+        </w:tc>
+        <w:tc>
+          <w:tcPr>
+            <w:tcW w:type="dxa" w:w="2160"/>
+          </w:tcPr>
+          <w:p>
+            <w:r/>
+            <w:r>
+              <w:rPr>
+                <w:b/>
+                <w:sz w:val="18"/>
+              </w:rPr>
+              <w:t>Notes</w:t>
+            </w:r>
+          </w:p>
+        </w:tc>
+      </w:tr>
+      <w:tr>
+        <w:tc>
+          <w:tcPr>
+            <w:tcW w:type="dxa" w:w="2160"/>
+          </w:tcPr>
+          <w:p>
+            <w:r/>
+            <w:r>
+              <w:rPr>
+                <w:sz w:val="18"/>
+              </w:rPr>
+              <w:t>GET /buyer/order-form</w:t>
+            </w:r>
+          </w:p>
+        </w:tc>
+        <w:tc>
+          <w:tcPr>
+            <w:tcW w:type="dxa" w:w="2160"/>
+          </w:tcPr>
+          <w:p>
+            <w:r/>
+            <w:r>
+              <w:rPr>
+                <w:sz w:val="18"/>
+              </w:rPr>
+              <w:t>-</w:t>
+            </w:r>
+          </w:p>
+        </w:tc>
+        <w:tc>
+          <w:tcPr>
+            <w:tcW w:type="dxa" w:w="2160"/>
+          </w:tcPr>
+          <w:p>
+            <w:r/>
+            <w:r>
+              <w:rPr>
+                <w:sz w:val="18"/>
+              </w:rPr>
+              <w:t>BuyerOrderFormResponse</w:t>
+            </w:r>
+          </w:p>
+        </w:tc>
+        <w:tc>
+          <w:tcPr>
+            <w:tcW w:type="dxa" w:w="2160"/>
+          </w:tcPr>
+          <w:p>
+            <w:r/>
+            <w:r>
+              <w:rPr>
+                <w:sz w:val="18"/>
+              </w:rPr>
+              <w:t>Buyer. Active crops + varieties, earliest_delivery_by (today + rate_config buyer_min_lead_time_days), payment_options (MTN MoMo, Telecel Cash, AT Money, Card), payer_phone, active provider.</w:t>
+            </w:r>
+          </w:p>
+        </w:tc>
+      </w:tr>
+      <w:tr>
+        <w:tc>
+          <w:tcPr>
+            <w:tcW w:type="dxa" w:w="2160"/>
+          </w:tcPr>
+          <w:p>
+            <w:r/>
+            <w:r>
+              <w:rPr>
+                <w:sz w:val="18"/>
+              </w:rPr>
+              <w:t>GET /buyer/fee-quote?quantity_tonnes&amp;price_per_tonne</w:t>
+            </w:r>
+          </w:p>
+        </w:tc>
+        <w:tc>
+          <w:tcPr>
+            <w:tcW w:type="dxa" w:w="2160"/>
+          </w:tcPr>
+          <w:p>
+            <w:r/>
+            <w:r>
+              <w:rPr>
+                <w:sz w:val="18"/>
+              </w:rPr>
+              <w:t>-</w:t>
+            </w:r>
+          </w:p>
+        </w:tc>
+        <w:tc>
+          <w:tcPr>
+            <w:tcW w:type="dxa" w:w="2160"/>
+          </w:tcPr>
+          <w:p>
+            <w:r/>
+            <w:r>
+              <w:rPr>
+                <w:sz w:val="18"/>
+              </w:rPr>
+              <w:t>FeeQuoteResponse</w:t>
+            </w:r>
+          </w:p>
+        </w:tc>
+        <w:tc>
+          <w:tcPr>
+            <w:tcW w:type="dxa" w:w="2160"/>
+          </w:tcPr>
+          <w:p>
+            <w:r/>
+            <w:r>
+              <w:rPr>
+                <w:sz w:val="18"/>
+              </w:rPr>
+              <w:t>Buyer. Computes the fee with the active commitment fee rule; explanation is human-readable.</w:t>
+            </w:r>
+          </w:p>
+        </w:tc>
+      </w:tr>
+      <w:tr>
+        <w:tc>
+          <w:tcPr>
+            <w:tcW w:type="dxa" w:w="2160"/>
+          </w:tcPr>
+          <w:p>
+            <w:r/>
+            <w:r>
+              <w:rPr>
+                <w:sz w:val="18"/>
+              </w:rPr>
+              <w:t>POST /buyer/requirements</w:t>
+            </w:r>
+          </w:p>
+        </w:tc>
+        <w:tc>
+          <w:tcPr>
+            <w:tcW w:type="dxa" w:w="2160"/>
+          </w:tcPr>
+          <w:p>
+            <w:r/>
+            <w:r>
+              <w:rPr>
+                <w:sz w:val="18"/>
+              </w:rPr>
+              <w:t>RequirementCreate {quantity_tonnes, crop_variety_id?, delivery_by?, spec_notes?, price_per_tonne?, grade?, delivery_location?, delivery_timeline?}</w:t>
+            </w:r>
+          </w:p>
+        </w:tc>
+        <w:tc>
+          <w:tcPr>
+            <w:tcW w:type="dxa" w:w="2160"/>
+          </w:tcPr>
+          <w:p>
+            <w:r/>
+            <w:r>
+              <w:rPr>
+                <w:sz w:val="18"/>
+              </w:rPr>
+              <w:t>RequirementResponse</w:t>
+            </w:r>
+          </w:p>
+        </w:tc>
+        <w:tc>
+          <w:tcPr>
+            <w:tcW w:type="dxa" w:w="2160"/>
+          </w:tcPr>
+          <w:p>
+            <w:r/>
+            <w:r>
+              <w:rPr>
+                <w:sz w:val="18"/>
+              </w:rPr>
+              <w:t>Buyer. Assigns the next FM-#### reference from a Postgres sequence. Price defaults to the crop reference price. 422 if the variety/crop is not active, quantity &lt;= 0, or delivery_by is earlier than the minimum lead time. Legacy body (grade/location/timeline, no variety) is still accepted and defaults to the pilot crop.</w:t>
+            </w:r>
+          </w:p>
+        </w:tc>
+      </w:tr>
+      <w:tr>
+        <w:tc>
+          <w:tcPr>
+            <w:tcW w:type="dxa" w:w="2160"/>
+          </w:tcPr>
+          <w:p>
+            <w:r/>
+            <w:r>
+              <w:rPr>
+                <w:sz w:val="18"/>
+              </w:rPr>
+              <w:t>POST /buyer/requirements/{id}/pay</w:t>
+            </w:r>
+          </w:p>
+        </w:tc>
+        <w:tc>
+          <w:tcPr>
+            <w:tcW w:type="dxa" w:w="2160"/>
+          </w:tcPr>
+          <w:p>
+            <w:r/>
+            <w:r>
+              <w:rPr>
+                <w:sz w:val="18"/>
+              </w:rPr>
+              <w:t>PaymentRequest {network?: mtn_momo|telecel_cash|at_money|card, method?: legacy momo|vodafone|airteltigo|card, payer_phone?}</w:t>
+            </w:r>
+          </w:p>
+        </w:tc>
+        <w:tc>
+          <w:tcPr>
+            <w:tcW w:type="dxa" w:w="2160"/>
+          </w:tcPr>
+          <w:p>
+            <w:r/>
+            <w:r>
+              <w:rPr>
+                <w:sz w:val="18"/>
+              </w:rPr>
+              <w:t>PaymentResponse (status pending)</w:t>
+            </w:r>
+          </w:p>
+        </w:tc>
+        <w:tc>
+          <w:tcPr>
+            <w:tcW w:type="dxa" w:w="2160"/>
+          </w:tcPr>
+          <w:p>
+            <w:r/>
+            <w:r>
+              <w:rPr>
+                <w:sz w:val="18"/>
+              </w:rPr>
+              <w:t>Buyer, own requirement in pending_payment. 422 bad method or missing MoMo number; 409 if not payable or a payment is already pending; 502 provider error. A failed payment can be retried.</w:t>
+            </w:r>
+          </w:p>
+        </w:tc>
+      </w:tr>
+      <w:tr>
+        <w:tc>
+          <w:tcPr>
+            <w:tcW w:type="dxa" w:w="2160"/>
+          </w:tcPr>
+          <w:p>
+            <w:r/>
+            <w:r>
+              <w:rPr>
+                <w:sz w:val="18"/>
+              </w:rPr>
+              <w:t>GET /buyer/payments/{id}</w:t>
+            </w:r>
+          </w:p>
+        </w:tc>
+        <w:tc>
+          <w:tcPr>
+            <w:tcW w:type="dxa" w:w="2160"/>
+          </w:tcPr>
+          <w:p>
+            <w:r/>
+            <w:r>
+              <w:rPr>
+                <w:sz w:val="18"/>
+              </w:rPr>
+              <w:t>-</w:t>
+            </w:r>
+          </w:p>
+        </w:tc>
+        <w:tc>
+          <w:tcPr>
+            <w:tcW w:type="dxa" w:w="2160"/>
+          </w:tcPr>
+          <w:p>
+            <w:r/>
+            <w:r>
+              <w:rPr>
+                <w:sz w:val="18"/>
+              </w:rPr>
+              <w:t>PaymentResponse</w:t>
+            </w:r>
+          </w:p>
+        </w:tc>
+        <w:tc>
+          <w:tcPr>
+            <w:tcW w:type="dxa" w:w="2160"/>
+          </w:tcPr>
+          <w:p>
+            <w:r/>
+            <w:r>
+              <w:rPr>
+                <w:sz w:val="18"/>
+              </w:rPr>
+              <w:t>Buyer, own payment only. Polled by the payment modal.</w:t>
+            </w:r>
+          </w:p>
+        </w:tc>
+      </w:tr>
+      <w:tr>
+        <w:tc>
+          <w:tcPr>
+            <w:tcW w:type="dxa" w:w="2160"/>
+          </w:tcPr>
+          <w:p>
+            <w:r/>
+            <w:r>
+              <w:rPr>
+                <w:sz w:val="18"/>
+              </w:rPr>
+              <w:t>POST /payments/webhook/{provider}</w:t>
+            </w:r>
+          </w:p>
+        </w:tc>
+        <w:tc>
+          <w:tcPr>
+            <w:tcW w:type="dxa" w:w="2160"/>
+          </w:tcPr>
+          <w:p>
+            <w:r/>
+            <w:r>
+              <w:rPr>
+                <w:sz w:val="18"/>
+              </w:rPr>
+              <w:t>raw provider callback</w:t>
+            </w:r>
+          </w:p>
+        </w:tc>
+        <w:tc>
+          <w:tcPr>
+            <w:tcW w:type="dxa" w:w="2160"/>
+          </w:tcPr>
+          <w:p>
+            <w:r/>
+            <w:r>
+              <w:rPr>
+                <w:sz w:val="18"/>
+              </w:rPr>
+              <w:t>{ok, payment_status}</w:t>
+            </w:r>
+          </w:p>
+        </w:tc>
+        <w:tc>
+          <w:tcPr>
+            <w:tcW w:type="dxa" w:w="2160"/>
+          </w:tcPr>
+          <w:p>
+            <w:r/>
+            <w:r>
+              <w:rPr>
+                <w:sz w:val="18"/>
+              </w:rPr>
+              <w:t>No auth: trust comes from the driver (sandbox HMAC-SHA256 x-sandbox-signature; Paystack HMAC-SHA512 x-paystack-signature; Hubtel server-side Transaction Status check). 400 unverifiable, 404 unknown reference or inactive provider. Idempotent; an amount mismatch fails the payment.</w:t>
+            </w:r>
+          </w:p>
+        </w:tc>
+      </w:tr>
+      <w:tr>
+        <w:tc>
+          <w:tcPr>
+            <w:tcW w:type="dxa" w:w="2160"/>
+          </w:tcPr>
+          <w:p>
+            <w:r/>
+            <w:r>
+              <w:rPr>
+                <w:sz w:val="18"/>
+              </w:rPr>
+              <w:t>POST /payments/sandbox/{provider_ref}/approve|decline</w:t>
+            </w:r>
+          </w:p>
+        </w:tc>
+        <w:tc>
+          <w:tcPr>
+            <w:tcW w:type="dxa" w:w="2160"/>
+          </w:tcPr>
+          <w:p>
+            <w:r/>
+            <w:r>
+              <w:rPr>
+                <w:sz w:val="18"/>
+              </w:rPr>
+              <w:t>-</w:t>
+            </w:r>
+          </w:p>
+        </w:tc>
+        <w:tc>
+          <w:tcPr>
+            <w:tcW w:type="dxa" w:w="2160"/>
+          </w:tcPr>
+          <w:p>
+            <w:r/>
+            <w:r>
+              <w:rPr>
+                <w:sz w:val="18"/>
+              </w:rPr>
+              <w:t>{ok, payment_status}</w:t>
+            </w:r>
+          </w:p>
+        </w:tc>
+        <w:tc>
+          <w:tcPr>
+            <w:tcW w:type="dxa" w:w="2160"/>
+          </w:tcPr>
+          <w:p>
+            <w:r/>
+            <w:r>
+              <w:rPr>
+                <w:sz w:val="18"/>
+              </w:rPr>
+              <w:t>Only while the sandbox provider is active; only the paying buyer or Super Admin. Simulates the payer phone by sending a signed webhook through the same path.</w:t>
+            </w:r>
+          </w:p>
+        </w:tc>
+      </w:tr>
+      <w:tr>
+        <w:tc>
+          <w:tcPr>
+            <w:tcW w:type="dxa" w:w="2160"/>
+          </w:tcPr>
+          <w:p>
+            <w:r/>
+            <w:r>
+              <w:rPr>
+                <w:sz w:val="18"/>
+              </w:rPr>
+              <w:t>GET /ops/payments?status</w:t>
+            </w:r>
+          </w:p>
+        </w:tc>
+        <w:tc>
+          <w:tcPr>
+            <w:tcW w:type="dxa" w:w="2160"/>
+          </w:tcPr>
+          <w:p>
+            <w:r/>
+            <w:r>
+              <w:rPr>
+                <w:sz w:val="18"/>
+              </w:rPr>
+              <w:t>-</w:t>
+            </w:r>
+          </w:p>
+        </w:tc>
+        <w:tc>
+          <w:tcPr>
+            <w:tcW w:type="dxa" w:w="2160"/>
+          </w:tcPr>
+          <w:p>
+            <w:r/>
+            <w:r>
+              <w:rPr>
+                <w:sz w:val="18"/>
+              </w:rPr>
+              <w:t>List[OpsPaymentRow]</w:t>
+            </w:r>
+          </w:p>
+        </w:tc>
+        <w:tc>
+          <w:tcPr>
+            <w:tcW w:type="dxa" w:w="2160"/>
+          </w:tcPr>
+          <w:p>
+            <w:r/>
+            <w:r>
+              <w:rPr>
+                <w:sz w:val="18"/>
+              </w:rPr>
+              <w:t>Finance, Super Admin, Compliance Officer (read-only). Commitment-fee payments with order reference, buyer, network, provider ref, status, failure reason.</w:t>
+            </w:r>
+          </w:p>
+        </w:tc>
+      </w:tr>
+      <w:tr>
+        <w:tc>
+          <w:tcPr>
+            <w:tcW w:type="dxa" w:w="2160"/>
+          </w:tcPr>
+          <w:p>
+            <w:r/>
+            <w:r>
+              <w:rPr>
+                <w:sz w:val="18"/>
+              </w:rPr>
+              <w:t>GET /admin/commitment-fee-rules</w:t>
+            </w:r>
+          </w:p>
+        </w:tc>
+        <w:tc>
+          <w:tcPr>
+            <w:tcW w:type="dxa" w:w="2160"/>
+          </w:tcPr>
+          <w:p>
+            <w:r/>
+            <w:r>
+              <w:rPr>
+                <w:sz w:val="18"/>
+              </w:rPr>
+              <w:t>-</w:t>
+            </w:r>
+          </w:p>
+        </w:tc>
+        <w:tc>
+          <w:tcPr>
+            <w:tcW w:type="dxa" w:w="2160"/>
+          </w:tcPr>
+          <w:p>
+            <w:r/>
+            <w:r>
+              <w:rPr>
+                <w:sz w:val="18"/>
+              </w:rPr>
+              <w:t>List[CommitmentFeeRuleResponse]</w:t>
+            </w:r>
+          </w:p>
+        </w:tc>
+        <w:tc>
+          <w:tcPr>
+            <w:tcW w:type="dxa" w:w="2160"/>
+          </w:tcPr>
+          <w:p>
+            <w:r/>
+            <w:r>
+              <w:rPr>
+                <w:sz w:val="18"/>
+              </w:rPr>
+              <w:t>Super Admin. Newest first; exactly one is_active.</w:t>
+            </w:r>
+          </w:p>
+        </w:tc>
+      </w:tr>
+      <w:tr>
+        <w:tc>
+          <w:tcPr>
+            <w:tcW w:type="dxa" w:w="2160"/>
+          </w:tcPr>
+          <w:p>
+            <w:r/>
+            <w:r>
+              <w:rPr>
+                <w:sz w:val="18"/>
+              </w:rPr>
+              <w:t>POST /admin/commitment-fee-rules</w:t>
+            </w:r>
+          </w:p>
+        </w:tc>
+        <w:tc>
+          <w:tcPr>
+            <w:tcW w:type="dxa" w:w="2160"/>
+          </w:tcPr>
+          <w:p>
+            <w:r/>
+            <w:r>
+              <w:rPr>
+                <w:sz w:val="18"/>
+              </w:rPr>
+              <w:t>CommitmentFeeRuleCreate {name, basis: per_tonne|percent_of_value, rate, minimum_amount}</w:t>
+            </w:r>
+          </w:p>
+        </w:tc>
+        <w:tc>
+          <w:tcPr>
+            <w:tcW w:type="dxa" w:w="2160"/>
+          </w:tcPr>
+          <w:p>
+            <w:r/>
+            <w:r>
+              <w:rPr>
+                <w:sz w:val="18"/>
+              </w:rPr>
+              <w:t>CommitmentFeeRuleResponse</w:t>
+            </w:r>
+          </w:p>
+        </w:tc>
+        <w:tc>
+          <w:tcPr>
+            <w:tcW w:type="dxa" w:w="2160"/>
+          </w:tcPr>
+          <w:p>
+            <w:r/>
+            <w:r>
+              <w:rPr>
+                <w:sz w:val="18"/>
+              </w:rPr>
+              <w:t>Super Admin. Activates the new rule and deactivates the previous one (audited). 422 for rate &lt;= 0, percent rate &gt;= 1, negative minimum.</w:t>
+            </w:r>
+          </w:p>
+        </w:tc>
+      </w:tr>
+      <w:tr>
+        <w:tc>
+          <w:tcPr>
+            <w:tcW w:type="dxa" w:w="2160"/>
+          </w:tcPr>
+          <w:p>
+            <w:r/>
+            <w:r>
+              <w:rPr>
+                <w:sz w:val="18"/>
+              </w:rPr>
+              <w:t>PUT /admin/rates/buyer_commitment_fee_per_tonne</w:t>
+            </w:r>
+          </w:p>
+        </w:tc>
+        <w:tc>
+          <w:tcPr>
+            <w:tcW w:type="dxa" w:w="2160"/>
+          </w:tcPr>
+          <w:p>
+            <w:r/>
+            <w:r>
+              <w:rPr>
+                <w:sz w:val="18"/>
+              </w:rPr>
+              <w:t>-</w:t>
+            </w:r>
+          </w:p>
+        </w:tc>
+        <w:tc>
+          <w:tcPr>
+            <w:tcW w:type="dxa" w:w="2160"/>
+          </w:tcPr>
+          <w:p>
+            <w:r/>
+            <w:r>
+              <w:rPr>
+                <w:sz w:val="18"/>
+              </w:rPr>
+              <w:t>409</w:t>
+            </w:r>
+          </w:p>
+        </w:tc>
+        <w:tc>
+          <w:tcPr>
+            <w:tcW w:type="dxa" w:w="2160"/>
+          </w:tcPr>
+          <w:p>
+            <w:r/>
+            <w:r>
+              <w:rPr>
+                <w:sz w:val="18"/>
+              </w:rPr>
+              <w:t>Superseded by the fee rules; refused with a pointer to the new endpoint.</w:t>
             </w:r>
           </w:p>
         </w:tc>

</xml_diff>

<commit_message>
feat(logistics): fleet, logistics events, aggregation and state transitions
Brief 7/8: vehicles table (pilot fleet at Tema) linked from dispatch and
trunking jobs; append-only logistics_events emitted at every dispatch,
delivery, intake, trunking and order step, with anonymised public text;
intakes recorded per centre and crop, the first graded lot moving an order
to Aggregating. Public /api/public/activity feed, /ops/vehicles,
/ops/aggregation and an ops order-advance action. app/state.py transition
tables now guard every status change (409 otherwise). Migration 0004 plus
an autogenerate fixer; API docs 22, SDD 37, schema doc, CHANGELOG.

Co-Authored-By: Claude Opus 5.5 <noreply@anthropic.com>
</commit_message>
<xml_diff>
--- a/Farm_Master_API_Documentation_Stage6.docx
+++ b/Farm_Master_API_Documentation_Stage6.docx
@@ -7562,6 +7562,384 @@
                 <w:sz w:val="18"/>
               </w:rPr>
               <w:t>Superseded by the fee rules; refused with a pointer to the new endpoint.</w:t>
+            </w:r>
+          </w:p>
+        </w:tc>
+      </w:tr>
+    </w:tbl>
+    <w:p>
+      <w:pPr>
+        <w:pStyle w:val="Heading1"/>
+      </w:pPr>
+      <w:r>
+        <w:t>22. Fleet, Logistics Events and Order Progression (added 11 October 2026)</w:t>
+      </w:r>
+    </w:p>
+    <w:p>
+      <w:r>
+        <w:t>Dispatch and trunking now resolve tricycle_label / vehicle_label to a registered fleet vehicle ("#1" -&gt; "Tricycle #1"); an unregistered label is still accepted without a vehicle link. Every dispatch, delivery, intake, trunking and order step appends a logistics_events row.</w:t>
+      </w:r>
+    </w:p>
+    <w:tbl>
+      <w:tblPr>
+        <w:tblStyle w:val="TableGrid"/>
+        <w:tblW w:type="auto" w:w="0"/>
+        <w:tblLook w:firstColumn="1" w:firstRow="1" w:lastColumn="0" w:lastRow="0" w:noHBand="0" w:noVBand="1" w:val="04A0"/>
+      </w:tblPr>
+      <w:tblGrid>
+        <w:gridCol w:w="2160"/>
+        <w:gridCol w:w="2160"/>
+        <w:gridCol w:w="2160"/>
+        <w:gridCol w:w="2160"/>
+      </w:tblGrid>
+      <w:tr>
+        <w:tc>
+          <w:tcPr>
+            <w:tcW w:type="dxa" w:w="2160"/>
+          </w:tcPr>
+          <w:p>
+            <w:r/>
+            <w:r>
+              <w:rPr>
+                <w:b/>
+                <w:sz w:val="18"/>
+              </w:rPr>
+              <w:t>Method &amp; path</w:t>
+            </w:r>
+          </w:p>
+        </w:tc>
+        <w:tc>
+          <w:tcPr>
+            <w:tcW w:type="dxa" w:w="2160"/>
+          </w:tcPr>
+          <w:p>
+            <w:r/>
+            <w:r>
+              <w:rPr>
+                <w:b/>
+                <w:sz w:val="18"/>
+              </w:rPr>
+              <w:t>Request body</w:t>
+            </w:r>
+          </w:p>
+        </w:tc>
+        <w:tc>
+          <w:tcPr>
+            <w:tcW w:type="dxa" w:w="2160"/>
+          </w:tcPr>
+          <w:p>
+            <w:r/>
+            <w:r>
+              <w:rPr>
+                <w:b/>
+                <w:sz w:val="18"/>
+              </w:rPr>
+              <w:t>Response</w:t>
+            </w:r>
+          </w:p>
+        </w:tc>
+        <w:tc>
+          <w:tcPr>
+            <w:tcW w:type="dxa" w:w="2160"/>
+          </w:tcPr>
+          <w:p>
+            <w:r/>
+            <w:r>
+              <w:rPr>
+                <w:b/>
+                <w:sz w:val="18"/>
+              </w:rPr>
+              <w:t>Notes</w:t>
+            </w:r>
+          </w:p>
+        </w:tc>
+      </w:tr>
+      <w:tr>
+        <w:tc>
+          <w:tcPr>
+            <w:tcW w:type="dxa" w:w="2160"/>
+          </w:tcPr>
+          <w:p>
+            <w:r/>
+            <w:r>
+              <w:rPr>
+                <w:sz w:val="18"/>
+              </w:rPr>
+              <w:t>GET /api/public/activity?limit=10</w:t>
+            </w:r>
+          </w:p>
+        </w:tc>
+        <w:tc>
+          <w:tcPr>
+            <w:tcW w:type="dxa" w:w="2160"/>
+          </w:tcPr>
+          <w:p>
+            <w:r/>
+            <w:r>
+              <w:rPr>
+                <w:sz w:val="18"/>
+              </w:rPr>
+              <w:t>-</w:t>
+            </w:r>
+          </w:p>
+        </w:tc>
+        <w:tc>
+          <w:tcPr>
+            <w:tcW w:type="dxa" w:w="2160"/>
+          </w:tcPr>
+          <w:p>
+            <w:r/>
+            <w:r>
+              <w:rPr>
+                <w:sz w:val="18"/>
+              </w:rPr>
+              <w:t>List[{text, at}]</w:t>
+            </w:r>
+          </w:p>
+        </w:tc>
+        <w:tc>
+          <w:tcPr>
+            <w:tcW w:type="dxa" w:w="2160"/>
+          </w:tcPr>
+          <w:p>
+            <w:r/>
+            <w:r>
+              <w:rPr>
+                <w:sz w:val="18"/>
+              </w:rPr>
+              <w:t>No auth. Today's per-centre aggregation line(s), a 'N harvest pickups completed in the last hour' line, then the latest events' public_text. Anonymised: no names or phone numbers.</w:t>
+            </w:r>
+          </w:p>
+        </w:tc>
+      </w:tr>
+      <w:tr>
+        <w:tc>
+          <w:tcPr>
+            <w:tcW w:type="dxa" w:w="2160"/>
+          </w:tcPr>
+          <w:p>
+            <w:r/>
+            <w:r>
+              <w:rPr>
+                <w:sz w:val="18"/>
+              </w:rPr>
+              <w:t>GET /ops/vehicles</w:t>
+            </w:r>
+          </w:p>
+        </w:tc>
+        <w:tc>
+          <w:tcPr>
+            <w:tcW w:type="dxa" w:w="2160"/>
+          </w:tcPr>
+          <w:p>
+            <w:r/>
+            <w:r>
+              <w:rPr>
+                <w:sz w:val="18"/>
+              </w:rPr>
+              <w:t>-</w:t>
+            </w:r>
+          </w:p>
+        </w:tc>
+        <w:tc>
+          <w:tcPr>
+            <w:tcW w:type="dxa" w:w="2160"/>
+          </w:tcPr>
+          <w:p>
+            <w:r/>
+            <w:r>
+              <w:rPr>
+                <w:sz w:val="18"/>
+              </w:rPr>
+              <w:t>List[VehicleResponse]</w:t>
+            </w:r>
+          </w:p>
+        </w:tc>
+        <w:tc>
+          <w:tcPr>
+            <w:tcW w:type="dxa" w:w="2160"/>
+          </w:tcPr>
+          <w:p>
+            <w:r/>
+            <w:r>
+              <w:rPr>
+                <w:sz w:val="18"/>
+              </w:rPr>
+              <w:t>Logistics, Super Admin, Operations Coordinator. code, type, home centre, status (available/on_job/maintenance).</w:t>
+            </w:r>
+          </w:p>
+        </w:tc>
+      </w:tr>
+      <w:tr>
+        <w:tc>
+          <w:tcPr>
+            <w:tcW w:type="dxa" w:w="2160"/>
+          </w:tcPr>
+          <w:p>
+            <w:r/>
+            <w:r>
+              <w:rPr>
+                <w:sz w:val="18"/>
+              </w:rPr>
+              <w:t>GET /ops/aggregation</w:t>
+            </w:r>
+          </w:p>
+        </w:tc>
+        <w:tc>
+          <w:tcPr>
+            <w:tcW w:type="dxa" w:w="2160"/>
+          </w:tcPr>
+          <w:p>
+            <w:r/>
+            <w:r>
+              <w:rPr>
+                <w:sz w:val="18"/>
+              </w:rPr>
+              <w:t>-</w:t>
+            </w:r>
+          </w:p>
+        </w:tc>
+        <w:tc>
+          <w:tcPr>
+            <w:tcW w:type="dxa" w:w="2160"/>
+          </w:tcPr>
+          <w:p>
+            <w:r/>
+            <w:r>
+              <w:rPr>
+                <w:sz w:val="18"/>
+              </w:rPr>
+              <w:t>List[AggregationRow]</w:t>
+            </w:r>
+          </w:p>
+        </w:tc>
+        <w:tc>
+          <w:tcPr>
+            <w:tcW w:type="dxa" w:w="2160"/>
+          </w:tcPr>
+          <w:p>
+            <w:r/>
+            <w:r>
+              <w:rPr>
+                <w:sz w:val="18"/>
+              </w:rPr>
+              <w:t>Logistics, Super Admin, Operations Coordinator, Finance. Non-reject tonnes graded today per centre and crop.</w:t>
+            </w:r>
+          </w:p>
+        </w:tc>
+      </w:tr>
+      <w:tr>
+        <w:tc>
+          <w:tcPr>
+            <w:tcW w:type="dxa" w:w="2160"/>
+          </w:tcPr>
+          <w:p>
+            <w:r/>
+            <w:r>
+              <w:rPr>
+                <w:sz w:val="18"/>
+              </w:rPr>
+              <w:t>POST /ops/requirements/{id}/advance</w:t>
+            </w:r>
+          </w:p>
+        </w:tc>
+        <w:tc>
+          <w:tcPr>
+            <w:tcW w:type="dxa" w:w="2160"/>
+          </w:tcPr>
+          <w:p>
+            <w:r/>
+            <w:r>
+              <w:rPr>
+                <w:sz w:val="18"/>
+              </w:rPr>
+              <w:t>OrderAdvanceRequest {status: shipment|delivered}</w:t>
+            </w:r>
+          </w:p>
+        </w:tc>
+        <w:tc>
+          <w:tcPr>
+            <w:tcW w:type="dxa" w:w="2160"/>
+          </w:tcPr>
+          <w:p>
+            <w:r/>
+            <w:r>
+              <w:rPr>
+                <w:sz w:val="18"/>
+              </w:rPr>
+              <w:t>RequirementResponse</w:t>
+            </w:r>
+          </w:p>
+        </w:tc>
+        <w:tc>
+          <w:tcPr>
+            <w:tcW w:type="dxa" w:w="2160"/>
+          </w:tcPr>
+          <w:p>
+            <w:r/>
+            <w:r>
+              <w:rPr>
+                <w:sz w:val="18"/>
+              </w:rPr>
+              <w:t>Logistics, Super Admin, Operations Coordinator. Only aggregation -&gt; shipment -&gt; delivered; 409 for any other move, 422 for other targets. Audited and emits an event.</w:t>
+            </w:r>
+          </w:p>
+        </w:tc>
+      </w:tr>
+      <w:tr>
+        <w:tc>
+          <w:tcPr>
+            <w:tcW w:type="dxa" w:w="2160"/>
+          </w:tcPr>
+          <w:p>
+            <w:r/>
+            <w:r>
+              <w:rPr>
+                <w:sz w:val="18"/>
+              </w:rPr>
+              <w:t>GET /buyer/requirements/{id}/tracking</w:t>
+            </w:r>
+          </w:p>
+        </w:tc>
+        <w:tc>
+          <w:tcPr>
+            <w:tcW w:type="dxa" w:w="2160"/>
+          </w:tcPr>
+          <w:p>
+            <w:r/>
+            <w:r>
+              <w:rPr>
+                <w:sz w:val="18"/>
+              </w:rPr>
+              <w:t>-</w:t>
+            </w:r>
+          </w:p>
+        </w:tc>
+        <w:tc>
+          <w:tcPr>
+            <w:tcW w:type="dxa" w:w="2160"/>
+          </w:tcPr>
+          <w:p>
+            <w:r/>
+            <w:r>
+              <w:rPr>
+                <w:sz w:val="18"/>
+              </w:rPr>
+              <w:t>BuyerTrackingResponse</w:t>
+            </w:r>
+          </w:p>
+        </w:tc>
+        <w:tc>
+          <w:tcPr>
+            <w:tcW w:type="dxa" w:w="2160"/>
+          </w:tcPr>
+          <w:p>
+            <w:r/>
+            <w:r>
+              <w:rPr>
+                <w:sz w:val="18"/>
+              </w:rPr>
+              <w:t>Now also lists the order's logistics events.</w:t>
             </w:r>
           </w:p>
         </w:tc>

</xml_diff>

<commit_message>
feat(farmer): matching, formula steps, 48h agronomist tasks, wallet ledger
Brief 4: Phase 1 matching by region + registered crop (and no longer
leaking other farmers' assignments), enriched matched-opportunity rows
with stepper stage and formula steps (variety templates + buyer spec,
agronomist-editable). Accepting creates a 48h agronomist task plus in-app
and SMS notifications. Append-only wallet_ledger behind the estimated
payout (decision D4). Ops agronomist task queue. Migration 0005; API docs
23, SDD 39, schema doc, CHANGELOG.

Co-Authored-By: Claude Opus 5.5 <noreply@anthropic.com>
</commit_message>
<xml_diff>
--- a/Farm_Master_API_Documentation_Stage6.docx
+++ b/Farm_Master_API_Documentation_Stage6.docx
@@ -7940,6 +7940,611 @@
                 <w:sz w:val="18"/>
               </w:rPr>
               <w:t>Now also lists the order's logistics events.</w:t>
+            </w:r>
+          </w:p>
+        </w:tc>
+      </w:tr>
+    </w:tbl>
+    <w:p>
+      <w:pPr>
+        <w:pStyle w:val="Heading1"/>
+      </w:pPr>
+      <w:r>
+        <w:t>23. Farmer Matching, Wallet Ledger, Formula Steps and Agronomist Tasks (added 11 October 2026)</w:t>
+      </w:r>
+    </w:p>
+    <w:tbl>
+      <w:tblPr>
+        <w:tblStyle w:val="TableGrid"/>
+        <w:tblW w:type="auto" w:w="0"/>
+        <w:tblLook w:firstColumn="1" w:firstRow="1" w:lastColumn="0" w:lastRow="0" w:noHBand="0" w:noVBand="1" w:val="04A0"/>
+      </w:tblPr>
+      <w:tblGrid>
+        <w:gridCol w:w="2160"/>
+        <w:gridCol w:w="2160"/>
+        <w:gridCol w:w="2160"/>
+        <w:gridCol w:w="2160"/>
+      </w:tblGrid>
+      <w:tr>
+        <w:tc>
+          <w:tcPr>
+            <w:tcW w:type="dxa" w:w="2160"/>
+          </w:tcPr>
+          <w:p>
+            <w:r/>
+            <w:r>
+              <w:rPr>
+                <w:b/>
+                <w:sz w:val="18"/>
+              </w:rPr>
+              <w:t>Method &amp; path</w:t>
+            </w:r>
+          </w:p>
+        </w:tc>
+        <w:tc>
+          <w:tcPr>
+            <w:tcW w:type="dxa" w:w="2160"/>
+          </w:tcPr>
+          <w:p>
+            <w:r/>
+            <w:r>
+              <w:rPr>
+                <w:b/>
+                <w:sz w:val="18"/>
+              </w:rPr>
+              <w:t>Request body</w:t>
+            </w:r>
+          </w:p>
+        </w:tc>
+        <w:tc>
+          <w:tcPr>
+            <w:tcW w:type="dxa" w:w="2160"/>
+          </w:tcPr>
+          <w:p>
+            <w:r/>
+            <w:r>
+              <w:rPr>
+                <w:b/>
+                <w:sz w:val="18"/>
+              </w:rPr>
+              <w:t>Response</w:t>
+            </w:r>
+          </w:p>
+        </w:tc>
+        <w:tc>
+          <w:tcPr>
+            <w:tcW w:type="dxa" w:w="2160"/>
+          </w:tcPr>
+          <w:p>
+            <w:r/>
+            <w:r>
+              <w:rPr>
+                <w:b/>
+                <w:sz w:val="18"/>
+              </w:rPr>
+              <w:t>Notes</w:t>
+            </w:r>
+          </w:p>
+        </w:tc>
+      </w:tr>
+      <w:tr>
+        <w:tc>
+          <w:tcPr>
+            <w:tcW w:type="dxa" w:w="2160"/>
+          </w:tcPr>
+          <w:p>
+            <w:r/>
+            <w:r>
+              <w:rPr>
+                <w:sz w:val="18"/>
+              </w:rPr>
+              <w:t>GET /farmer/matched-opportunities</w:t>
+            </w:r>
+          </w:p>
+        </w:tc>
+        <w:tc>
+          <w:tcPr>
+            <w:tcW w:type="dxa" w:w="2160"/>
+          </w:tcPr>
+          <w:p>
+            <w:r/>
+            <w:r>
+              <w:rPr>
+                <w:sz w:val="18"/>
+              </w:rPr>
+              <w:t>-</w:t>
+            </w:r>
+          </w:p>
+        </w:tc>
+        <w:tc>
+          <w:tcPr>
+            <w:tcW w:type="dxa" w:w="2160"/>
+          </w:tcPr>
+          <w:p>
+            <w:r/>
+            <w:r>
+              <w:rPr>
+                <w:sz w:val="18"/>
+              </w:rPr>
+              <w:t>List[MatchedOpportunityResponse]</w:t>
+            </w:r>
+          </w:p>
+        </w:tc>
+        <w:tc>
+          <w:tcPr>
+            <w:tcW w:type="dxa" w:w="2160"/>
+          </w:tcPr>
+          <w:p>
+            <w:r/>
+            <w:r>
+              <w:rPr>
+                <w:sz w:val="18"/>
+              </w:rPr>
+              <w:t>Farmer. Open matches plus own accepted ones: crop + icon, variety, region, delivery_by, delivery_in_weeks, stage_index over steps [Matched, Accepted, In production, Harvest &amp; delivery], formula_steps (with this farmer's input quantities once accepted).</w:t>
+            </w:r>
+          </w:p>
+        </w:tc>
+      </w:tr>
+      <w:tr>
+        <w:tc>
+          <w:tcPr>
+            <w:tcW w:type="dxa" w:w="2160"/>
+          </w:tcPr>
+          <w:p>
+            <w:r/>
+            <w:r>
+              <w:rPr>
+                <w:sz w:val="18"/>
+              </w:rPr>
+              <w:t>GET /farmer/opportunities, /farmer/opportunities/{id}</w:t>
+            </w:r>
+          </w:p>
+        </w:tc>
+        <w:tc>
+          <w:tcPr>
+            <w:tcW w:type="dxa" w:w="2160"/>
+          </w:tcPr>
+          <w:p>
+            <w:r/>
+            <w:r>
+              <w:rPr>
+                <w:sz w:val="18"/>
+              </w:rPr>
+              <w:t>-</w:t>
+            </w:r>
+          </w:p>
+        </w:tc>
+        <w:tc>
+          <w:tcPr>
+            <w:tcW w:type="dxa" w:w="2160"/>
+          </w:tcPr>
+          <w:p>
+            <w:r/>
+            <w:r>
+              <w:rPr>
+                <w:sz w:val="18"/>
+              </w:rPr>
+              <w:t>unchanged shapes</w:t>
+            </w:r>
+          </w:p>
+        </w:tc>
+        <w:tc>
+          <w:tcPr>
+            <w:tcW w:type="dxa" w:w="2160"/>
+          </w:tcPr>
+          <w:p>
+            <w:r/>
+            <w:r>
+              <w:rPr>
+                <w:sz w:val="18"/>
+              </w:rPr>
+              <w:t>Now filtered: assigned to me, or unassigned with matching region (or none) and a crop I grow (or none). Another farmer's assignment is a 404.</w:t>
+            </w:r>
+          </w:p>
+        </w:tc>
+      </w:tr>
+      <w:tr>
+        <w:tc>
+          <w:tcPr>
+            <w:tcW w:type="dxa" w:w="2160"/>
+          </w:tcPr>
+          <w:p>
+            <w:r/>
+            <w:r>
+              <w:rPr>
+                <w:sz w:val="18"/>
+              </w:rPr>
+              <w:t>POST /farmer/opportunities/{id}/accept</w:t>
+            </w:r>
+          </w:p>
+        </w:tc>
+        <w:tc>
+          <w:tcPr>
+            <w:tcW w:type="dxa" w:w="2160"/>
+          </w:tcPr>
+          <w:p>
+            <w:r/>
+            <w:r>
+              <w:rPr>
+                <w:sz w:val="18"/>
+              </w:rPr>
+              <w:t>{commitments_confirmed: true}</w:t>
+            </w:r>
+          </w:p>
+        </w:tc>
+        <w:tc>
+          <w:tcPr>
+            <w:tcW w:type="dxa" w:w="2160"/>
+          </w:tcPr>
+          <w:p>
+            <w:r/>
+            <w:r>
+              <w:rPr>
+                <w:sz w:val="18"/>
+              </w:rPr>
+              <w:t>ProductionFormulaResponse</w:t>
+            </w:r>
+          </w:p>
+        </w:tc>
+        <w:tc>
+          <w:tcPr>
+            <w:tcW w:type="dxa" w:w="2160"/>
+          </w:tcPr>
+          <w:p>
+            <w:r/>
+            <w:r>
+              <w:rPr>
+                <w:sz w:val="18"/>
+              </w:rPr>
+              <w:t>Also creates a 48h ACCEPTANCE_FOLLOW_UP agronomist task (rate_config agronomist_task_sla_hours), an in-app notification and a simulated SMS, and posts the estimated settlement to wallet_ledger.</w:t>
+            </w:r>
+          </w:p>
+        </w:tc>
+      </w:tr>
+      <w:tr>
+        <w:tc>
+          <w:tcPr>
+            <w:tcW w:type="dxa" w:w="2160"/>
+          </w:tcPr>
+          <w:p>
+            <w:r/>
+            <w:r>
+              <w:rPr>
+                <w:sz w:val="18"/>
+              </w:rPr>
+              <w:t>GET /farmer/wallet/summary</w:t>
+            </w:r>
+          </w:p>
+        </w:tc>
+        <w:tc>
+          <w:tcPr>
+            <w:tcW w:type="dxa" w:w="2160"/>
+          </w:tcPr>
+          <w:p>
+            <w:r/>
+            <w:r>
+              <w:rPr>
+                <w:sz w:val="18"/>
+              </w:rPr>
+              <w:t>-</w:t>
+            </w:r>
+          </w:p>
+        </w:tc>
+        <w:tc>
+          <w:tcPr>
+            <w:tcW w:type="dxa" w:w="2160"/>
+          </w:tcPr>
+          <w:p>
+            <w:r/>
+            <w:r>
+              <w:rPr>
+                <w:sz w:val="18"/>
+              </w:rPr>
+              <w:t>FarmerWalletSummaryResponse</w:t>
+            </w:r>
+          </w:p>
+        </w:tc>
+        <w:tc>
+          <w:tcPr>
+            <w:tcW w:type="dxa" w:w="2160"/>
+          </w:tcPr>
+          <w:p>
+            <w:r/>
+            <w:r>
+              <w:rPr>
+                <w:sz w:val="18"/>
+              </w:rPr>
+              <w:t>Farmer. input_costs, logistics_fees, estimated_settlement, estimated_payout and the ledger entries. Syncs the ledger idempotently first.</w:t>
+            </w:r>
+          </w:p>
+        </w:tc>
+      </w:tr>
+      <w:tr>
+        <w:tc>
+          <w:tcPr>
+            <w:tcW w:type="dxa" w:w="2160"/>
+          </w:tcPr>
+          <w:p>
+            <w:r/>
+            <w:r>
+              <w:rPr>
+                <w:sz w:val="18"/>
+              </w:rPr>
+              <w:t>GET /farmer/notifications</w:t>
+            </w:r>
+          </w:p>
+        </w:tc>
+        <w:tc>
+          <w:tcPr>
+            <w:tcW w:type="dxa" w:w="2160"/>
+          </w:tcPr>
+          <w:p>
+            <w:r/>
+            <w:r>
+              <w:rPr>
+                <w:sz w:val="18"/>
+              </w:rPr>
+              <w:t>-</w:t>
+            </w:r>
+          </w:p>
+        </w:tc>
+        <w:tc>
+          <w:tcPr>
+            <w:tcW w:type="dxa" w:w="2160"/>
+          </w:tcPr>
+          <w:p>
+            <w:r/>
+            <w:r>
+              <w:rPr>
+                <w:sz w:val="18"/>
+              </w:rPr>
+              <w:t>List[FarmerNotificationResponse]</w:t>
+            </w:r>
+          </w:p>
+        </w:tc>
+        <w:tc>
+          <w:tcPr>
+            <w:tcW w:type="dxa" w:w="2160"/>
+          </w:tcPr>
+          <w:p>
+            <w:r/>
+            <w:r>
+              <w:rPr>
+                <w:sz w:val="18"/>
+              </w:rPr>
+              <w:t>Farmer. Latest 50.</w:t>
+            </w:r>
+          </w:p>
+        </w:tc>
+      </w:tr>
+      <w:tr>
+        <w:tc>
+          <w:tcPr>
+            <w:tcW w:type="dxa" w:w="2160"/>
+          </w:tcPr>
+          <w:p>
+            <w:r/>
+            <w:r>
+              <w:rPr>
+                <w:sz w:val="18"/>
+              </w:rPr>
+              <w:t>GET /agronomist/requirements/{id}/formula-steps</w:t>
+            </w:r>
+          </w:p>
+        </w:tc>
+        <w:tc>
+          <w:tcPr>
+            <w:tcW w:type="dxa" w:w="2160"/>
+          </w:tcPr>
+          <w:p>
+            <w:r/>
+            <w:r>
+              <w:rPr>
+                <w:sz w:val="18"/>
+              </w:rPr>
+              <w:t>-</w:t>
+            </w:r>
+          </w:p>
+        </w:tc>
+        <w:tc>
+          <w:tcPr>
+            <w:tcW w:type="dxa" w:w="2160"/>
+          </w:tcPr>
+          <w:p>
+            <w:r/>
+            <w:r>
+              <w:rPr>
+                <w:sz w:val="18"/>
+              </w:rPr>
+              <w:t>FormulaStepsResponse</w:t>
+            </w:r>
+          </w:p>
+        </w:tc>
+        <w:tc>
+          <w:tcPr>
+            <w:tcW w:type="dxa" w:w="2160"/>
+          </w:tcPr>
+          <w:p>
+            <w:r/>
+            <w:r>
+              <w:rPr>
+                <w:sz w:val="18"/>
+              </w:rPr>
+              <w:t>Agronomist. Saved steps, or the variety template + buyer spec notes draft (authored=false).</w:t>
+            </w:r>
+          </w:p>
+        </w:tc>
+      </w:tr>
+      <w:tr>
+        <w:tc>
+          <w:tcPr>
+            <w:tcW w:type="dxa" w:w="2160"/>
+          </w:tcPr>
+          <w:p>
+            <w:r/>
+            <w:r>
+              <w:rPr>
+                <w:sz w:val="18"/>
+              </w:rPr>
+              <w:t>PUT /agronomist/requirements/{id}/formula-steps</w:t>
+            </w:r>
+          </w:p>
+        </w:tc>
+        <w:tc>
+          <w:tcPr>
+            <w:tcW w:type="dxa" w:w="2160"/>
+          </w:tcPr>
+          <w:p>
+            <w:r/>
+            <w:r>
+              <w:rPr>
+                <w:sz w:val="18"/>
+              </w:rPr>
+              <w:t>{steps: [str]}</w:t>
+            </w:r>
+          </w:p>
+        </w:tc>
+        <w:tc>
+          <w:tcPr>
+            <w:tcW w:type="dxa" w:w="2160"/>
+          </w:tcPr>
+          <w:p>
+            <w:r/>
+            <w:r>
+              <w:rPr>
+                <w:sz w:val="18"/>
+              </w:rPr>
+              <w:t>FormulaStepsResponse</w:t>
+            </w:r>
+          </w:p>
+        </w:tc>
+        <w:tc>
+          <w:tcPr>
+            <w:tcW w:type="dxa" w:w="2160"/>
+          </w:tcPr>
+          <w:p>
+            <w:r/>
+            <w:r>
+              <w:rPr>
+                <w:sz w:val="18"/>
+              </w:rPr>
+              <w:t>Agronomist. Replaces the checklist; blanks dropped; 1-20 steps (422 otherwise). Audited.</w:t>
+            </w:r>
+          </w:p>
+        </w:tc>
+      </w:tr>
+      <w:tr>
+        <w:tc>
+          <w:tcPr>
+            <w:tcW w:type="dxa" w:w="2160"/>
+          </w:tcPr>
+          <w:p>
+            <w:r/>
+            <w:r>
+              <w:rPr>
+                <w:sz w:val="18"/>
+              </w:rPr>
+              <w:t>GET /ops/agronomist-tasks?status=open|done</w:t>
+            </w:r>
+          </w:p>
+        </w:tc>
+        <w:tc>
+          <w:tcPr>
+            <w:tcW w:type="dxa" w:w="2160"/>
+          </w:tcPr>
+          <w:p>
+            <w:r/>
+            <w:r>
+              <w:rPr>
+                <w:sz w:val="18"/>
+              </w:rPr>
+              <w:t>-</w:t>
+            </w:r>
+          </w:p>
+        </w:tc>
+        <w:tc>
+          <w:tcPr>
+            <w:tcW w:type="dxa" w:w="2160"/>
+          </w:tcPr>
+          <w:p>
+            <w:r/>
+            <w:r>
+              <w:rPr>
+                <w:sz w:val="18"/>
+              </w:rPr>
+              <w:t>List[AgronomistTaskResponse]</w:t>
+            </w:r>
+          </w:p>
+        </w:tc>
+        <w:tc>
+          <w:tcPr>
+            <w:tcW w:type="dxa" w:w="2160"/>
+          </w:tcPr>
+          <w:p>
+            <w:r/>
+            <w:r>
+              <w:rPr>
+                <w:sz w:val="18"/>
+              </w:rPr>
+              <w:t>Agronomist, Super Admin, Operations Coordinator. Ordered by due time; overdue flag.</w:t>
+            </w:r>
+          </w:p>
+        </w:tc>
+      </w:tr>
+      <w:tr>
+        <w:tc>
+          <w:tcPr>
+            <w:tcW w:type="dxa" w:w="2160"/>
+          </w:tcPr>
+          <w:p>
+            <w:r/>
+            <w:r>
+              <w:rPr>
+                <w:sz w:val="18"/>
+              </w:rPr>
+              <w:t>POST /ops/agronomist-tasks/{id}/complete</w:t>
+            </w:r>
+          </w:p>
+        </w:tc>
+        <w:tc>
+          <w:tcPr>
+            <w:tcW w:type="dxa" w:w="2160"/>
+          </w:tcPr>
+          <w:p>
+            <w:r/>
+            <w:r>
+              <w:rPr>
+                <w:sz w:val="18"/>
+              </w:rPr>
+              <w:t>{notes?}</w:t>
+            </w:r>
+          </w:p>
+        </w:tc>
+        <w:tc>
+          <w:tcPr>
+            <w:tcW w:type="dxa" w:w="2160"/>
+          </w:tcPr>
+          <w:p>
+            <w:r/>
+            <w:r>
+              <w:rPr>
+                <w:sz w:val="18"/>
+              </w:rPr>
+              <w:t>AgronomistTaskResponse</w:t>
+            </w:r>
+          </w:p>
+        </w:tc>
+        <w:tc>
+          <w:tcPr>
+            <w:tcW w:type="dxa" w:w="2160"/>
+          </w:tcPr>
+          <w:p>
+            <w:r/>
+            <w:r>
+              <w:rPr>
+                <w:sz w:val="18"/>
+              </w:rPr>
+              <w:t>Agronomist, Super Admin. 409 if already done. Audited.</w:t>
             </w:r>
           </w:p>
         </w:tc>

</xml_diff>

<commit_message>
feat(marketplace): farmer marketplace on listings with per-vendor checkout
Decision D1 / brief 6.1: listings gain kind, pricing basis, formula input
type, service code and icon; the CEO demo's nine-item catalogue is seeded
(third-party inputs + a new Farm Master-owned services vendor). Cart
checkout splits per vendor, requires dates for equipment/services,
reserves and restores stock, debits the wallet ledger, turns agronomist
visits into tasks and notifies vendors. Vendor confirmation still creates
the logistics job (flagged as an open question). Migration 0006; API docs
24, SDD 41, schema doc, CHANGELOG.

Co-Authored-By: Claude Opus 5.5 <noreply@anthropic.com>
</commit_message>
<xml_diff>
--- a/Farm_Master_API_Documentation_Stage6.docx
+++ b/Farm_Master_API_Documentation_Stage6.docx
@@ -8545,6 +8545,263 @@
                 <w:sz w:val="18"/>
               </w:rPr>
               <w:t>Agronomist, Super Admin. 409 if already done. Audited.</w:t>
+            </w:r>
+          </w:p>
+        </w:tc>
+      </w:tr>
+    </w:tbl>
+    <w:p>
+      <w:pPr>
+        <w:pStyle w:val="Heading1"/>
+      </w:pPr>
+      <w:r>
+        <w:t>24. Farmer Marketplace (added 11 October 2026)</w:t>
+      </w:r>
+    </w:p>
+    <w:tbl>
+      <w:tblPr>
+        <w:tblStyle w:val="TableGrid"/>
+        <w:tblW w:type="auto" w:w="0"/>
+        <w:tblLook w:firstColumn="1" w:firstRow="1" w:lastColumn="0" w:lastRow="0" w:noHBand="0" w:noVBand="1" w:val="04A0"/>
+      </w:tblPr>
+      <w:tblGrid>
+        <w:gridCol w:w="2160"/>
+        <w:gridCol w:w="2160"/>
+        <w:gridCol w:w="2160"/>
+        <w:gridCol w:w="2160"/>
+      </w:tblGrid>
+      <w:tr>
+        <w:tc>
+          <w:tcPr>
+            <w:tcW w:type="dxa" w:w="2160"/>
+          </w:tcPr>
+          <w:p>
+            <w:r/>
+            <w:r>
+              <w:rPr>
+                <w:b/>
+                <w:sz w:val="18"/>
+              </w:rPr>
+              <w:t>Method &amp; path</w:t>
+            </w:r>
+          </w:p>
+        </w:tc>
+        <w:tc>
+          <w:tcPr>
+            <w:tcW w:type="dxa" w:w="2160"/>
+          </w:tcPr>
+          <w:p>
+            <w:r/>
+            <w:r>
+              <w:rPr>
+                <w:b/>
+                <w:sz w:val="18"/>
+              </w:rPr>
+              <w:t>Request body</w:t>
+            </w:r>
+          </w:p>
+        </w:tc>
+        <w:tc>
+          <w:tcPr>
+            <w:tcW w:type="dxa" w:w="2160"/>
+          </w:tcPr>
+          <w:p>
+            <w:r/>
+            <w:r>
+              <w:rPr>
+                <w:b/>
+                <w:sz w:val="18"/>
+              </w:rPr>
+              <w:t>Response</w:t>
+            </w:r>
+          </w:p>
+        </w:tc>
+        <w:tc>
+          <w:tcPr>
+            <w:tcW w:type="dxa" w:w="2160"/>
+          </w:tcPr>
+          <w:p>
+            <w:r/>
+            <w:r>
+              <w:rPr>
+                <w:b/>
+                <w:sz w:val="18"/>
+              </w:rPr>
+              <w:t>Notes</w:t>
+            </w:r>
+          </w:p>
+        </w:tc>
+      </w:tr>
+      <w:tr>
+        <w:tc>
+          <w:tcPr>
+            <w:tcW w:type="dxa" w:w="2160"/>
+          </w:tcPr>
+          <w:p>
+            <w:r/>
+            <w:r>
+              <w:rPr>
+                <w:sz w:val="18"/>
+              </w:rPr>
+              <w:t>GET /farmer/marketplace?kind=input|equipment|service</w:t>
+            </w:r>
+          </w:p>
+        </w:tc>
+        <w:tc>
+          <w:tcPr>
+            <w:tcW w:type="dxa" w:w="2160"/>
+          </w:tcPr>
+          <w:p>
+            <w:r/>
+            <w:r>
+              <w:rPr>
+                <w:sz w:val="18"/>
+              </w:rPr>
+              <w:t>-</w:t>
+            </w:r>
+          </w:p>
+        </w:tc>
+        <w:tc>
+          <w:tcPr>
+            <w:tcW w:type="dxa" w:w="2160"/>
+          </w:tcPr>
+          <w:p>
+            <w:r/>
+            <w:r>
+              <w:rPr>
+                <w:sz w:val="18"/>
+              </w:rPr>
+              <w:t>MarketplaceCatalogueResponse</w:t>
+            </w:r>
+          </w:p>
+        </w:tc>
+        <w:tc>
+          <w:tcPr>
+            <w:tcW w:type="dxa" w:w="2160"/>
+          </w:tcPr>
+          <w:p>
+            <w:r/>
+            <w:r>
+              <w:rPr>
+                <w:sz w:val="18"/>
+              </w:rPr>
+              <w:t>Farmer. tabs (Seeds &amp; Inputs, Equipment Rental, Mechanisation Services), active listings with vendor name and owned flag, price + unit, pricing basis, needs_date, icon/image, stock; delivery_sla_days.</w:t>
+            </w:r>
+          </w:p>
+        </w:tc>
+      </w:tr>
+      <w:tr>
+        <w:tc>
+          <w:tcPr>
+            <w:tcW w:type="dxa" w:w="2160"/>
+          </w:tcPr>
+          <w:p>
+            <w:r/>
+            <w:r>
+              <w:rPr>
+                <w:sz w:val="18"/>
+              </w:rPr>
+              <w:t>POST /farmer/marketplace/orders</w:t>
+            </w:r>
+          </w:p>
+        </w:tc>
+        <w:tc>
+          <w:tcPr>
+            <w:tcW w:type="dxa" w:w="2160"/>
+          </w:tcPr>
+          <w:p>
+            <w:r/>
+            <w:r>
+              <w:rPr>
+                <w:sz w:val="18"/>
+              </w:rPr>
+              <w:t>MarketplaceOrderCreate {lines: [{listing_id, quantity, requested_date?}]}</w:t>
+            </w:r>
+          </w:p>
+        </w:tc>
+        <w:tc>
+          <w:tcPr>
+            <w:tcW w:type="dxa" w:w="2160"/>
+          </w:tcPr>
+          <w:p>
+            <w:r/>
+            <w:r>
+              <w:rPr>
+                <w:sz w:val="18"/>
+              </w:rPr>
+              <w:t>MarketplaceOrderResult</w:t>
+            </w:r>
+          </w:p>
+        </w:tc>
+        <w:tc>
+          <w:tcPr>
+            <w:tcW w:type="dxa" w:w="2160"/>
+          </w:tcPr>
+          <w:p>
+            <w:r/>
+            <w:r>
+              <w:rPr>
+                <w:sz w:val="18"/>
+              </w:rPr>
+              <w:t>Farmer. Duplicate lines merge. One InputOrder per vendor sharing checkout_ref. 422 empty cart, quantity &lt;= 0, missing or past date on equipment/service; 404 inactive listing; 409 over stock. Reserves stock, debits the wallet, creates a farm-visit agronomist task for agronomist_visit lines, notifies each vendor. message = 'Order routed to Farm Master logistics - estimated farm-gate delivery in {N} days.' (N = rate_config marketplace_delivery_sla_days).</w:t>
+            </w:r>
+          </w:p>
+        </w:tc>
+      </w:tr>
+      <w:tr>
+        <w:tc>
+          <w:tcPr>
+            <w:tcW w:type="dxa" w:w="2160"/>
+          </w:tcPr>
+          <w:p>
+            <w:r/>
+            <w:r>
+              <w:rPr>
+                <w:sz w:val="18"/>
+              </w:rPr>
+              <w:t>GET /vendor/input-orders, POST .../{id}/confirm|decline</w:t>
+            </w:r>
+          </w:p>
+        </w:tc>
+        <w:tc>
+          <w:tcPr>
+            <w:tcW w:type="dxa" w:w="2160"/>
+          </w:tcPr>
+          <w:p>
+            <w:r/>
+            <w:r>
+              <w:rPr>
+                <w:sz w:val="18"/>
+              </w:rPr>
+              <w:t>-</w:t>
+            </w:r>
+          </w:p>
+        </w:tc>
+        <w:tc>
+          <w:tcPr>
+            <w:tcW w:type="dxa" w:w="2160"/>
+          </w:tcPr>
+          <w:p>
+            <w:r/>
+            <w:r>
+              <w:rPr>
+                <w:sz w:val="18"/>
+              </w:rPr>
+              <w:t>InputOrderResponse</w:t>
+            </w:r>
+          </w:p>
+        </w:tc>
+        <w:tc>
+          <w:tcPr>
+            <w:tcW w:type="dxa" w:w="2160"/>
+          </w:tcPr>
+          <w:p>
+            <w:r/>
+            <w:r>
+              <w:rPr>
+                <w:sz w:val="18"/>
+              </w:rPr>
+              <w:t>Unchanged contract. Lines now also carry listing_id, kind and requested_date (product_id may be null). Decline restores listing stock and reverses the wallet debit; confirm creates the logistics job. Both go through app/state.py.</w:t>
             </w:r>
           </w:p>
         </w:tc>

</xml_diff>

<commit_message>
refactor(marketplace): retire products into listings (decision D1)
Every product is copied into an active listing (products.listing_id,
migration 0007) with its stock moved. Order Inputs' formula pre-fill moves
to GET /farmer/marketplace/formula-prefill and a banner on /marketplace;
marketplace orders carry production_formula_id so reconciliation links
survive. /order-inputs-flow redirects; the old product write endpoints
return 410 with a pointer; vendor catalogue screen and dashboard counts
read listings. Tests updated; RBAC matrix covers the new GET endpoints.
API docs 25, SDD 43, README, CHANGELOG.

Co-Authored-By: Claude Opus 5.5 <noreply@anthropic.com>
</commit_message>
<xml_diff>
--- a/Farm_Master_API_Documentation_Stage6.docx
+++ b/Farm_Master_API_Documentation_Stage6.docx
@@ -8802,6 +8802,321 @@
                 <w:sz w:val="18"/>
               </w:rPr>
               <w:t>Unchanged contract. Lines now also carry listing_id, kind and requested_date (product_id may be null). Decline restores listing stock and reverses the wallet debit; confirm creates the logistics job. Both go through app/state.py.</w:t>
+            </w:r>
+          </w:p>
+        </w:tc>
+      </w:tr>
+    </w:tbl>
+    <w:p>
+      <w:pPr>
+        <w:pStyle w:val="Heading1"/>
+      </w:pPr>
+      <w:r>
+        <w:t>25. Product Catalogue Retired (11 October 2026)</w:t>
+      </w:r>
+    </w:p>
+    <w:tbl>
+      <w:tblPr>
+        <w:tblStyle w:val="TableGrid"/>
+        <w:tblW w:type="auto" w:w="0"/>
+        <w:tblLook w:firstColumn="1" w:firstRow="1" w:lastColumn="0" w:lastRow="0" w:noHBand="0" w:noVBand="1" w:val="04A0"/>
+      </w:tblPr>
+      <w:tblGrid>
+        <w:gridCol w:w="2160"/>
+        <w:gridCol w:w="2160"/>
+        <w:gridCol w:w="2160"/>
+        <w:gridCol w:w="2160"/>
+      </w:tblGrid>
+      <w:tr>
+        <w:tc>
+          <w:tcPr>
+            <w:tcW w:type="dxa" w:w="2160"/>
+          </w:tcPr>
+          <w:p>
+            <w:r/>
+            <w:r>
+              <w:rPr>
+                <w:b/>
+                <w:sz w:val="18"/>
+              </w:rPr>
+              <w:t>Method &amp; path</w:t>
+            </w:r>
+          </w:p>
+        </w:tc>
+        <w:tc>
+          <w:tcPr>
+            <w:tcW w:type="dxa" w:w="2160"/>
+          </w:tcPr>
+          <w:p>
+            <w:r/>
+            <w:r>
+              <w:rPr>
+                <w:b/>
+                <w:sz w:val="18"/>
+              </w:rPr>
+              <w:t>Request body</w:t>
+            </w:r>
+          </w:p>
+        </w:tc>
+        <w:tc>
+          <w:tcPr>
+            <w:tcW w:type="dxa" w:w="2160"/>
+          </w:tcPr>
+          <w:p>
+            <w:r/>
+            <w:r>
+              <w:rPr>
+                <w:b/>
+                <w:sz w:val="18"/>
+              </w:rPr>
+              <w:t>Response</w:t>
+            </w:r>
+          </w:p>
+        </w:tc>
+        <w:tc>
+          <w:tcPr>
+            <w:tcW w:type="dxa" w:w="2160"/>
+          </w:tcPr>
+          <w:p>
+            <w:r/>
+            <w:r>
+              <w:rPr>
+                <w:b/>
+                <w:sz w:val="18"/>
+              </w:rPr>
+              <w:t>Notes</w:t>
+            </w:r>
+          </w:p>
+        </w:tc>
+      </w:tr>
+      <w:tr>
+        <w:tc>
+          <w:tcPr>
+            <w:tcW w:type="dxa" w:w="2160"/>
+          </w:tcPr>
+          <w:p>
+            <w:r/>
+            <w:r>
+              <w:rPr>
+                <w:sz w:val="18"/>
+              </w:rPr>
+              <w:t>GET /farmer/marketplace/formula-prefill?production_formula_id</w:t>
+            </w:r>
+          </w:p>
+        </w:tc>
+        <w:tc>
+          <w:tcPr>
+            <w:tcW w:type="dxa" w:w="2160"/>
+          </w:tcPr>
+          <w:p>
+            <w:r/>
+            <w:r>
+              <w:rPr>
+                <w:sz w:val="18"/>
+              </w:rPr>
+              <w:t>-</w:t>
+            </w:r>
+          </w:p>
+        </w:tc>
+        <w:tc>
+          <w:tcPr>
+            <w:tcW w:type="dxa" w:w="2160"/>
+          </w:tcPr>
+          <w:p>
+            <w:r/>
+            <w:r>
+              <w:rPr>
+                <w:sz w:val="18"/>
+              </w:rPr>
+              <w:t>FormulaPrefillResponse</w:t>
+            </w:r>
+          </w:p>
+        </w:tc>
+        <w:tc>
+          <w:tcPr>
+            <w:tcW w:type="dxa" w:w="2160"/>
+          </w:tcPr>
+          <w:p>
+            <w:r/>
+            <w:r>
+              <w:rPr>
+                <w:sz w:val="18"/>
+              </w:rPr>
+              <w:t>Farmer. Suggested lines from the farmer's latest (or given) production formula: the cheapest active listing per formula input type, quantity converted to the listing unit (kg seed -&gt; bags of N kg).</w:t>
+            </w:r>
+          </w:p>
+        </w:tc>
+      </w:tr>
+      <w:tr>
+        <w:tc>
+          <w:tcPr>
+            <w:tcW w:type="dxa" w:w="2160"/>
+          </w:tcPr>
+          <w:p>
+            <w:r/>
+            <w:r>
+              <w:rPr>
+                <w:sz w:val="18"/>
+              </w:rPr>
+              <w:t>POST /farmer/marketplace/orders</w:t>
+            </w:r>
+          </w:p>
+        </w:tc>
+        <w:tc>
+          <w:tcPr>
+            <w:tcW w:type="dxa" w:w="2160"/>
+          </w:tcPr>
+          <w:p>
+            <w:r/>
+            <w:r>
+              <w:rPr>
+                <w:sz w:val="18"/>
+              </w:rPr>
+              <w:t>+ production_formula_id?</w:t>
+            </w:r>
+          </w:p>
+        </w:tc>
+        <w:tc>
+          <w:tcPr>
+            <w:tcW w:type="dxa" w:w="2160"/>
+          </w:tcPr>
+          <w:p>
+            <w:r/>
+            <w:r>
+              <w:rPr>
+                <w:sz w:val="18"/>
+              </w:rPr>
+              <w:t>MarketplaceOrderResult</w:t>
+            </w:r>
+          </w:p>
+        </w:tc>
+        <w:tc>
+          <w:tcPr>
+            <w:tcW w:type="dxa" w:w="2160"/>
+          </w:tcPr>
+          <w:p>
+            <w:r/>
+            <w:r>
+              <w:rPr>
+                <w:sz w:val="18"/>
+              </w:rPr>
+              <w:t>Optional formula link stamped on every split order (422 if not the farmer's own).</w:t>
+            </w:r>
+          </w:p>
+        </w:tc>
+      </w:tr>
+      <w:tr>
+        <w:tc>
+          <w:tcPr>
+            <w:tcW w:type="dxa" w:w="2160"/>
+          </w:tcPr>
+          <w:p>
+            <w:r/>
+            <w:r>
+              <w:rPr>
+                <w:sz w:val="18"/>
+              </w:rPr>
+              <w:t>GET /farmer/catalogue, POST /farmer/input-orders, POST /vendor/catalogue</w:t>
+            </w:r>
+          </w:p>
+        </w:tc>
+        <w:tc>
+          <w:tcPr>
+            <w:tcW w:type="dxa" w:w="2160"/>
+          </w:tcPr>
+          <w:p>
+            <w:r/>
+            <w:r>
+              <w:rPr>
+                <w:sz w:val="18"/>
+              </w:rPr>
+              <w:t>-</w:t>
+            </w:r>
+          </w:p>
+        </w:tc>
+        <w:tc>
+          <w:tcPr>
+            <w:tcW w:type="dxa" w:w="2160"/>
+          </w:tcPr>
+          <w:p>
+            <w:r/>
+            <w:r>
+              <w:rPr>
+                <w:sz w:val="18"/>
+              </w:rPr>
+              <w:t>410</w:t>
+            </w:r>
+          </w:p>
+        </w:tc>
+        <w:tc>
+          <w:tcPr>
+            <w:tcW w:type="dxa" w:w="2160"/>
+          </w:tcPr>
+          <w:p>
+            <w:r/>
+            <w:r>
+              <w:rPr>
+                <w:sz w:val="18"/>
+              </w:rPr>
+              <w:t>Retired; the detail names the replacement endpoint.</w:t>
+            </w:r>
+          </w:p>
+        </w:tc>
+      </w:tr>
+      <w:tr>
+        <w:tc>
+          <w:tcPr>
+            <w:tcW w:type="dxa" w:w="2160"/>
+          </w:tcPr>
+          <w:p>
+            <w:r/>
+            <w:r>
+              <w:rPr>
+                <w:sz w:val="18"/>
+              </w:rPr>
+              <w:t>GET /vendor/dashboard</w:t>
+            </w:r>
+          </w:p>
+        </w:tc>
+        <w:tc>
+          <w:tcPr>
+            <w:tcW w:type="dxa" w:w="2160"/>
+          </w:tcPr>
+          <w:p>
+            <w:r/>
+            <w:r>
+              <w:rPr>
+                <w:sz w:val="18"/>
+              </w:rPr>
+              <w:t>-</w:t>
+            </w:r>
+          </w:p>
+        </w:tc>
+        <w:tc>
+          <w:tcPr>
+            <w:tcW w:type="dxa" w:w="2160"/>
+          </w:tcPr>
+          <w:p>
+            <w:r/>
+            <w:r>
+              <w:rPr>
+                <w:sz w:val="18"/>
+              </w:rPr>
+              <w:t>VendorDashboardResponse</w:t>
+            </w:r>
+          </w:p>
+        </w:tc>
+        <w:tc>
+          <w:tcPr>
+            <w:tcW w:type="dxa" w:w="2160"/>
+          </w:tcPr>
+          <w:p>
+            <w:r/>
+            <w:r>
+              <w:rPr>
+                <w:sz w:val="18"/>
+              </w:rPr>
+              <w:t>catalogue_item_count / catalogue_low_stock_count now count active or out-of-stock listings.</w:t>
             </w:r>
           </w:p>
         </w:tc>

</xml_diff>

<commit_message>
feat(ops): ops order list endpoint and multi-role portal bootstrap
GET /ops/requirements lists buyer orders logistics can advance; agronomist
requirement rows gain FM reference, crop and spec notes; FM.portal()
accepts several roles. API docs 26, CHANGELOG.

Co-Authored-By: Claude Opus 5.5 <noreply@anthropic.com>
</commit_message>
<xml_diff>
--- a/Farm_Master_API_Documentation_Stage6.docx
+++ b/Farm_Master_API_Documentation_Stage6.docx
@@ -9117,6 +9117,205 @@
                 <w:sz w:val="18"/>
               </w:rPr>
               <w:t>catalogue_item_count / catalogue_low_stock_count now count active or out-of-stock listings.</w:t>
+            </w:r>
+          </w:p>
+        </w:tc>
+      </w:tr>
+    </w:tbl>
+    <w:p>
+      <w:pPr>
+        <w:pStyle w:val="Heading1"/>
+      </w:pPr>
+      <w:r>
+        <w:t>26. Ops Order List (added 11 October 2026)</w:t>
+      </w:r>
+    </w:p>
+    <w:tbl>
+      <w:tblPr>
+        <w:tblStyle w:val="TableGrid"/>
+        <w:tblW w:type="auto" w:w="0"/>
+        <w:tblLook w:firstColumn="1" w:firstRow="1" w:lastColumn="0" w:lastRow="0" w:noHBand="0" w:noVBand="1" w:val="04A0"/>
+      </w:tblPr>
+      <w:tblGrid>
+        <w:gridCol w:w="2160"/>
+        <w:gridCol w:w="2160"/>
+        <w:gridCol w:w="2160"/>
+        <w:gridCol w:w="2160"/>
+      </w:tblGrid>
+      <w:tr>
+        <w:tc>
+          <w:tcPr>
+            <w:tcW w:type="dxa" w:w="2160"/>
+          </w:tcPr>
+          <w:p>
+            <w:r/>
+            <w:r>
+              <w:rPr>
+                <w:b/>
+                <w:sz w:val="18"/>
+              </w:rPr>
+              <w:t>Method &amp; path</w:t>
+            </w:r>
+          </w:p>
+        </w:tc>
+        <w:tc>
+          <w:tcPr>
+            <w:tcW w:type="dxa" w:w="2160"/>
+          </w:tcPr>
+          <w:p>
+            <w:r/>
+            <w:r>
+              <w:rPr>
+                <w:b/>
+                <w:sz w:val="18"/>
+              </w:rPr>
+              <w:t>Request body</w:t>
+            </w:r>
+          </w:p>
+        </w:tc>
+        <w:tc>
+          <w:tcPr>
+            <w:tcW w:type="dxa" w:w="2160"/>
+          </w:tcPr>
+          <w:p>
+            <w:r/>
+            <w:r>
+              <w:rPr>
+                <w:b/>
+                <w:sz w:val="18"/>
+              </w:rPr>
+              <w:t>Response</w:t>
+            </w:r>
+          </w:p>
+        </w:tc>
+        <w:tc>
+          <w:tcPr>
+            <w:tcW w:type="dxa" w:w="2160"/>
+          </w:tcPr>
+          <w:p>
+            <w:r/>
+            <w:r>
+              <w:rPr>
+                <w:b/>
+                <w:sz w:val="18"/>
+              </w:rPr>
+              <w:t>Notes</w:t>
+            </w:r>
+          </w:p>
+        </w:tc>
+      </w:tr>
+      <w:tr>
+        <w:tc>
+          <w:tcPr>
+            <w:tcW w:type="dxa" w:w="2160"/>
+          </w:tcPr>
+          <w:p>
+            <w:r/>
+            <w:r>
+              <w:rPr>
+                <w:sz w:val="18"/>
+              </w:rPr>
+              <w:t>GET /ops/requirements?status=aggregation&amp;status=shipment</w:t>
+            </w:r>
+          </w:p>
+        </w:tc>
+        <w:tc>
+          <w:tcPr>
+            <w:tcW w:type="dxa" w:w="2160"/>
+          </w:tcPr>
+          <w:p>
+            <w:r/>
+            <w:r>
+              <w:rPr>
+                <w:sz w:val="18"/>
+              </w:rPr>
+              <w:t>-</w:t>
+            </w:r>
+          </w:p>
+        </w:tc>
+        <w:tc>
+          <w:tcPr>
+            <w:tcW w:type="dxa" w:w="2160"/>
+          </w:tcPr>
+          <w:p>
+            <w:r/>
+            <w:r>
+              <w:rPr>
+                <w:sz w:val="18"/>
+              </w:rPr>
+              <w:t>List[RequirementResponse]</w:t>
+            </w:r>
+          </w:p>
+        </w:tc>
+        <w:tc>
+          <w:tcPr>
+            <w:tcW w:type="dxa" w:w="2160"/>
+          </w:tcPr>
+          <w:p>
+            <w:r/>
+            <w:r>
+              <w:rPr>
+                <w:sz w:val="18"/>
+              </w:rPr>
+              <w:t>Logistics, Super Admin, Operations Coordinator. Defaults to aggregation + shipment, the orders POST /ops/requirements/{id}/advance can move on.</w:t>
+            </w:r>
+          </w:p>
+        </w:tc>
+      </w:tr>
+      <w:tr>
+        <w:tc>
+          <w:tcPr>
+            <w:tcW w:type="dxa" w:w="2160"/>
+          </w:tcPr>
+          <w:p>
+            <w:r/>
+            <w:r>
+              <w:rPr>
+                <w:sz w:val="18"/>
+              </w:rPr>
+              <w:t>GET /agronomist/requirements</w:t>
+            </w:r>
+          </w:p>
+        </w:tc>
+        <w:tc>
+          <w:tcPr>
+            <w:tcW w:type="dxa" w:w="2160"/>
+          </w:tcPr>
+          <w:p>
+            <w:r/>
+            <w:r>
+              <w:rPr>
+                <w:sz w:val="18"/>
+              </w:rPr>
+              <w:t>-</w:t>
+            </w:r>
+          </w:p>
+        </w:tc>
+        <w:tc>
+          <w:tcPr>
+            <w:tcW w:type="dxa" w:w="2160"/>
+          </w:tcPr>
+          <w:p>
+            <w:r/>
+            <w:r>
+              <w:rPr>
+                <w:sz w:val="18"/>
+              </w:rPr>
+              <w:t>List[AgronomistRequirementResponse]</w:t>
+            </w:r>
+          </w:p>
+        </w:tc>
+        <w:tc>
+          <w:tcPr>
+            <w:tcW w:type="dxa" w:w="2160"/>
+          </w:tcPr>
+          <w:p>
+            <w:r/>
+            <w:r>
+              <w:rPr>
+                <w:sz w:val="18"/>
+              </w:rPr>
+              <w:t>Rows now also carry reference (FM-####), crop and spec_notes.</w:t>
             </w:r>
           </w:p>
         </w:tc>

</xml_diff>